<commit_message>
Ch4 R4: figure captions + verification diagrams + repo folder tidy
- Prom.1: descriptive bilingual figure captions on all 4 docx (+ FIGURE_CAPTIONS_R4)
- Prom.1: inline 3 verification comparison figures in section 4-4 (present vs
  Malekzadeh & Heydarpour + ANSYS, exact Bessel series, Bagri & Eslami) --
  diagrams, not tables only
- Prom.3 #1: folder tidy -- .m -> code/{solver,catalog,validation,extensions,misc},
  run_*.ps1 -> campaign/, governance + review docs -> governance/ + reviews/;
  data/figures/thesis_chapter kept at root; runners addpath('code/solver')
- all 4 docx rebuilt with captions + verification figures (26 figures each)

Co-Authored-By: Claude Opus 4.8 (1M context) <noreply@anthropic.com>
</commit_message>
<xml_diff>
--- a/claude/thesis_chapter/RESULTS_CHAPTER_EN_R4_bw.docx
+++ b/claude/thesis_chapter/RESULTS_CHAPTER_EN_R4_bw.docx
@@ -2,7 +2,7 @@
 <file path=word/document.xml><?xml version="1.0" encoding="utf-8"?>
 <w:document xmlns:w="http://schemas.openxmlformats.org/wordprocessingml/2006/main" xmlns:m="http://schemas.openxmlformats.org/officeDocument/2006/math" xmlns:r="http://schemas.openxmlformats.org/officeDocument/2006/relationships" xmlns:o="urn:schemas-microsoft-com:office:office" xmlns:v="urn:schemas-microsoft-com:vml" xmlns:w10="urn:schemas-microsoft-com:office:word" xmlns:a="http://schemas.openxmlformats.org/drawingml/2006/main" xmlns:pic="http://schemas.openxmlformats.org/drawingml/2006/picture" xmlns:wp="http://schemas.openxmlformats.org/drawingml/2006/wordprocessingDrawing">
   <w:body>
-    <w:bookmarkStart w:id="99" w:name="chapter-4-research-findings"/>
+    <w:bookmarkStart w:id="108" w:name="chapter-4-research-findings"/>
     <w:p>
       <w:pPr>
         <w:pStyle w:val="Heading1"/>
@@ -686,7 +686,7 @@
           <wp:inline>
             <wp:extent cx="5334000" cy="4002024"/>
             <wp:effectExtent b="0" l="0" r="0" t="0"/>
-            <wp:docPr descr="conv_NL" title="" id="12" name="Picture"/>
+            <wp:docPr descr="Layer-count convergence: hoop-stress and temperature profiles, L2 error and cost vs number of layers N_L (N_r=15, N_z=11)." title="" id="12" name="Picture"/>
             <a:graphic>
               <a:graphicData uri="http://schemas.openxmlformats.org/drawingml/2006/picture">
                 <pic:pic>
@@ -729,7 +729,7 @@
         <w:pStyle w:val="ImageCaption"/>
       </w:pPr>
       <w:r>
-        <w:t xml:space="preserve">conv_NL</w:t>
+        <w:t xml:space="preserve">Layer-count convergence: hoop-stress and temperature profiles, L2 error and cost vs number of layers N_L (N_r=15, N_z=11).</w:t>
       </w:r>
     </w:p>
     <w:p>
@@ -803,7 +803,7 @@
           <wp:inline>
             <wp:extent cx="5334000" cy="3243072"/>
             <wp:effectExtent b="0" l="0" r="0" t="0"/>
-            <wp:docPr descr="conv_Nr" title="" id="15" name="Picture"/>
+            <wp:docPr descr="Radial-node convergence per layer (N_z=11, N_L=7); the field quantities are converged from N_r=7." title="" id="15" name="Picture"/>
             <a:graphic>
               <a:graphicData uri="http://schemas.openxmlformats.org/drawingml/2006/picture">
                 <pic:pic>
@@ -846,7 +846,7 @@
         <w:pStyle w:val="ImageCaption"/>
       </w:pPr>
       <w:r>
-        <w:t xml:space="preserve">conv_Nr</w:t>
+        <w:t xml:space="preserve">Radial-node convergence per layer (N_z=11, N_L=7); the field quantities are converged from N_r=7.</w:t>
       </w:r>
     </w:p>
     <w:p>
@@ -926,7 +926,7 @@
           <wp:inline>
             <wp:extent cx="5334000" cy="3243072"/>
             <wp:effectExtent b="0" l="0" r="0" t="0"/>
-            <wp:docPr descr="conv_Nz" title="" id="18" name="Picture"/>
+            <wp:docPr descr="Axial-node convergence, the binding direction (N_r=15, N_L=7); N_z=5 gives a 9.4% error, with the clean serial cost." title="" id="18" name="Picture"/>
             <a:graphic>
               <a:graphicData uri="http://schemas.openxmlformats.org/drawingml/2006/picture">
                 <pic:pic>
@@ -969,7 +969,7 @@
         <w:pStyle w:val="ImageCaption"/>
       </w:pPr>
       <w:r>
-        <w:t xml:space="preserve">conv_Nz</w:t>
+        <w:t xml:space="preserve">Axial-node convergence, the binding direction (N_r=15, N_L=7); N_z=5 gives a 9.4% error, with the clean serial cost.</w:t>
       </w:r>
     </w:p>
     <w:p>
@@ -1055,7 +1055,7 @@
           <wp:inline>
             <wp:extent cx="5334000" cy="3243072"/>
             <wp:effectExtent b="0" l="0" r="0" t="0"/>
-            <wp:docPr descr="conv_dt" title="" id="21" name="Picture"/>
+            <wp:docPr descr="Time-step convergence; steps up to 2 s are converged while 5 s produces a spurious overshoot." title="" id="21" name="Picture"/>
             <a:graphic>
               <a:graphicData uri="http://schemas.openxmlformats.org/drawingml/2006/picture">
                 <pic:pic>
@@ -1098,7 +1098,7 @@
         <w:pStyle w:val="ImageCaption"/>
       </w:pPr>
       <w:r>
-        <w:t xml:space="preserve">conv_dt</w:t>
+        <w:t xml:space="preserve">Time-step convergence; steps up to 2 s are converged while 5 s produces a spurious overshoot.</w:t>
       </w:r>
     </w:p>
     <w:p>
@@ -1148,7 +1148,7 @@
           <wp:inline>
             <wp:extent cx="5334000" cy="4036178"/>
             <wp:effectExtent b="0" l="0" r="0" t="0"/>
-            <wp:docPr descr="conv_master" title="" id="24" name="Picture"/>
+            <wp:docPr descr="L2 hoop-profile error versus problem size N_dof, refined one direction at a time; the axial direction is binding." title="" id="24" name="Picture"/>
             <a:graphic>
               <a:graphicData uri="http://schemas.openxmlformats.org/drawingml/2006/picture">
                 <pic:pic>
@@ -1191,7 +1191,7 @@
         <w:pStyle w:val="ImageCaption"/>
       </w:pPr>
       <w:r>
-        <w:t xml:space="preserve">conv_master</w:t>
+        <w:t xml:space="preserve">L2 hoop-profile error versus problem size N_dof, refined one direction at a time; the axial direction is binding.</w:t>
       </w:r>
     </w:p>
     <w:p>
@@ -1263,7 +1263,7 @@
       </w:r>
     </w:p>
     <w:bookmarkEnd w:id="26"/>
-    <w:bookmarkStart w:id="27" w:name="verification"/>
+    <w:bookmarkStart w:id="36" w:name="verification"/>
     <w:p>
       <w:pPr>
         <w:pStyle w:val="Heading2"/>
@@ -1456,6 +1456,203 @@
       </w:r>
       <w:r>
         <w:t xml:space="preserve">summary is given in Table 4-2.</w:t>
+      </w:r>
+    </w:p>
+    <w:p>
+      <w:pPr>
+        <w:pStyle w:val="BodyText"/>
+      </w:pPr>
+      <w:r>
+        <w:t xml:space="preserve">The three checks that compare against published or exact references are shown</w:t>
+      </w:r>
+      <w:r>
+        <w:t xml:space="preserve"> </w:t>
+      </w:r>
+      <w:r>
+        <w:t xml:space="preserve">below — the mechanical response against Malekzadeh &amp; Heydarpour and ANSYS, the</w:t>
+      </w:r>
+      <w:r>
+        <w:t xml:space="preserve"> </w:t>
+      </w:r>
+      <w:r>
+        <w:t xml:space="preserve">transient conduction against the exact Bessel-series solution, and the coupled</w:t>
+      </w:r>
+      <w:r>
+        <w:t xml:space="preserve"> </w:t>
+      </w:r>
+      <w:r>
+        <w:t xml:space="preserve">Lord-Shulman wave fronts against Bagri &amp; Eslami — with the present curves</w:t>
+      </w:r>
+      <w:r>
+        <w:t xml:space="preserve"> </w:t>
+      </w:r>
+      <w:r>
+        <w:t xml:space="preserve">coinciding with the references in every case.</w:t>
+      </w:r>
+    </w:p>
+    <w:p>
+      <w:pPr>
+        <w:pStyle w:val="CaptionedFigure"/>
+      </w:pPr>
+      <w:r>
+        <w:drawing>
+          <wp:inline>
+            <wp:extent cx="5334000" cy="3810348"/>
+            <wp:effectExtent b="0" l="0" r="0" t="0"/>
+            <wp:docPr descr="Verification (mechanical): dimensionless inner-surface radial displacement of the present solver against Malekzadeh &amp; Heydarpour (2012) and an independent ANSYS solution." title="" id="28" name="Picture"/>
+            <a:graphic>
+              <a:graphicData uri="http://schemas.openxmlformats.org/drawingml/2006/picture">
+                <pic:pic>
+                  <pic:nvPicPr>
+                    <pic:cNvPr descr="figures_ch4_bw/bench1_U.png" id="29" name="Picture"/>
+                    <pic:cNvPicPr>
+                      <a:picLocks noChangeArrowheads="1" noChangeAspect="1"/>
+                    </pic:cNvPicPr>
+                  </pic:nvPicPr>
+                  <pic:blipFill>
+                    <a:blip r:embed="rId27"/>
+                    <a:stretch>
+                      <a:fillRect/>
+                    </a:stretch>
+                  </pic:blipFill>
+                  <pic:spPr bwMode="auto">
+                    <a:xfrm>
+                      <a:off x="0" y="0"/>
+                      <a:ext cx="5334000" cy="3810348"/>
+                    </a:xfrm>
+                    <a:prstGeom prst="rect">
+                      <a:avLst/>
+                    </a:prstGeom>
+                    <a:noFill/>
+                    <a:ln w="9525">
+                      <a:noFill/>
+                      <a:headEnd/>
+                      <a:tailEnd/>
+                    </a:ln>
+                  </pic:spPr>
+                </pic:pic>
+              </a:graphicData>
+            </a:graphic>
+          </wp:inline>
+        </w:drawing>
+      </w:r>
+    </w:p>
+    <w:p>
+      <w:pPr>
+        <w:pStyle w:val="ImageCaption"/>
+      </w:pPr>
+      <w:r>
+        <w:t xml:space="preserve">Verification (mechanical): dimensionless inner-surface radial displacement of the present solver against Malekzadeh &amp; Heydarpour (2012) and an independent ANSYS solution.</w:t>
+      </w:r>
+    </w:p>
+    <w:p>
+      <w:pPr>
+        <w:pStyle w:val="CaptionedFigure"/>
+      </w:pPr>
+      <w:r>
+        <w:drawing>
+          <wp:inline>
+            <wp:extent cx="5334000" cy="3697845"/>
+            <wp:effectExtent b="0" l="0" r="0" t="0"/>
+            <wp:docPr descr="Verification (thermal): transient temperature profiles from the present DQM+Newmark solver against the exact Bessel-series solution at t = 2, 10 and 40 s." title="" id="31" name="Picture"/>
+            <a:graphic>
+              <a:graphicData uri="http://schemas.openxmlformats.org/drawingml/2006/picture">
+                <pic:pic>
+                  <pic:nvPicPr>
+                    <pic:cNvPr descr="figures_ch4_bw/bench2_T_profiles.png" id="32" name="Picture"/>
+                    <pic:cNvPicPr>
+                      <a:picLocks noChangeArrowheads="1" noChangeAspect="1"/>
+                    </pic:cNvPicPr>
+                  </pic:nvPicPr>
+                  <pic:blipFill>
+                    <a:blip r:embed="rId30"/>
+                    <a:stretch>
+                      <a:fillRect/>
+                    </a:stretch>
+                  </pic:blipFill>
+                  <pic:spPr bwMode="auto">
+                    <a:xfrm>
+                      <a:off x="0" y="0"/>
+                      <a:ext cx="5334000" cy="3697845"/>
+                    </a:xfrm>
+                    <a:prstGeom prst="rect">
+                      <a:avLst/>
+                    </a:prstGeom>
+                    <a:noFill/>
+                    <a:ln w="9525">
+                      <a:noFill/>
+                      <a:headEnd/>
+                      <a:tailEnd/>
+                    </a:ln>
+                  </pic:spPr>
+                </pic:pic>
+              </a:graphicData>
+            </a:graphic>
+          </wp:inline>
+        </w:drawing>
+      </w:r>
+    </w:p>
+    <w:p>
+      <w:pPr>
+        <w:pStyle w:val="ImageCaption"/>
+      </w:pPr>
+      <w:r>
+        <w:t xml:space="preserve">Verification (thermal): transient temperature profiles from the present DQM+Newmark solver against the exact Bessel-series solution at t = 2, 10 and 40 s.</w:t>
+      </w:r>
+    </w:p>
+    <w:p>
+      <w:pPr>
+        <w:pStyle w:val="CaptionedFigure"/>
+      </w:pPr>
+      <w:r>
+        <w:drawing>
+          <wp:inline>
+            <wp:extent cx="5334000" cy="3472656"/>
+            <wp:effectExtent b="0" l="0" r="0" t="0"/>
+            <wp:docPr descr="Verification (Lord-Shulman waves): second-sound temperature fronts through the wall against Bagri &amp; Eslami (2007), Fig. 2." title="" id="34" name="Picture"/>
+            <a:graphic>
+              <a:graphicData uri="http://schemas.openxmlformats.org/drawingml/2006/picture">
+                <pic:pic>
+                  <pic:nvPicPr>
+                    <pic:cNvPr descr="figures_ch4_bw/bench3_theta.png" id="35" name="Picture"/>
+                    <pic:cNvPicPr>
+                      <a:picLocks noChangeArrowheads="1" noChangeAspect="1"/>
+                    </pic:cNvPicPr>
+                  </pic:nvPicPr>
+                  <pic:blipFill>
+                    <a:blip r:embed="rId33"/>
+                    <a:stretch>
+                      <a:fillRect/>
+                    </a:stretch>
+                  </pic:blipFill>
+                  <pic:spPr bwMode="auto">
+                    <a:xfrm>
+                      <a:off x="0" y="0"/>
+                      <a:ext cx="5334000" cy="3472656"/>
+                    </a:xfrm>
+                    <a:prstGeom prst="rect">
+                      <a:avLst/>
+                    </a:prstGeom>
+                    <a:noFill/>
+                    <a:ln w="9525">
+                      <a:noFill/>
+                      <a:headEnd/>
+                      <a:tailEnd/>
+                    </a:ln>
+                  </pic:spPr>
+                </pic:pic>
+              </a:graphicData>
+            </a:graphic>
+          </wp:inline>
+        </w:drawing>
+      </w:r>
+    </w:p>
+    <w:p>
+      <w:pPr>
+        <w:pStyle w:val="ImageCaption"/>
+      </w:pPr>
+      <w:r>
+        <w:t xml:space="preserve">Verification (Lord-Shulman waves): second-sound temperature fronts through the wall against Bagri &amp; Eslami (2007), Fig. 2.</w:t>
       </w:r>
     </w:p>
     <w:p>
@@ -1763,8 +1960,8 @@
         </w:tc>
       </w:tr>
     </w:tbl>
-    <w:bookmarkEnd w:id="27"/>
-    <w:bookmarkStart w:id="31" w:name="effect-of-the-gpl-distribution-pattern"/>
+    <w:bookmarkEnd w:id="36"/>
+    <w:bookmarkStart w:id="40" w:name="effect-of-the-gpl-distribution-pattern"/>
     <w:p>
       <w:pPr>
         <w:pStyle w:val="Heading2"/>
@@ -1820,18 +2017,18 @@
           <wp:inline>
             <wp:extent cx="5334000" cy="3297867"/>
             <wp:effectExtent b="0" l="0" r="0" t="0"/>
-            <wp:docPr descr="A_GPL_patterns" title="" id="29" name="Picture"/>
+            <wp:docPr descr="Effect of the GPL distribution pattern (UD, O, X, V, A): mid-point T* and U* histories vs Fo and the final T*, hoop-stress profiles vs xi." title="" id="38" name="Picture"/>
             <a:graphic>
               <a:graphicData uri="http://schemas.openxmlformats.org/drawingml/2006/picture">
                 <pic:pic>
                   <pic:nvPicPr>
-                    <pic:cNvPr descr="figures_ch4_bw/A_GPL_patterns.png" id="30" name="Picture"/>
+                    <pic:cNvPr descr="figures_ch4_bw/A_GPL_patterns.png" id="39" name="Picture"/>
                     <pic:cNvPicPr>
                       <a:picLocks noChangeArrowheads="1" noChangeAspect="1"/>
                     </pic:cNvPicPr>
                   </pic:nvPicPr>
                   <pic:blipFill>
-                    <a:blip r:embed="rId28"/>
+                    <a:blip r:embed="rId37"/>
                     <a:stretch>
                       <a:fillRect/>
                     </a:stretch>
@@ -1863,7 +2060,7 @@
         <w:pStyle w:val="ImageCaption"/>
       </w:pPr>
       <w:r>
-        <w:t xml:space="preserve">A_GPL_patterns</w:t>
+        <w:t xml:space="preserve">Effect of the GPL distribution pattern (UD, O, X, V, A): mid-point T* and U* histories vs Fo and the final T*, hoop-stress profiles vs xi.</w:t>
       </w:r>
     </w:p>
     <w:p>
@@ -2028,8 +2225,8 @@
         <w:t xml:space="preserve">cylinders under internal thermal shock.</w:t>
       </w:r>
     </w:p>
-    <w:bookmarkEnd w:id="31"/>
-    <w:bookmarkStart w:id="38" w:name="X010068c55f76942fb87a50811d0f7ee4b1eb2c3"/>
+    <w:bookmarkEnd w:id="40"/>
+    <w:bookmarkStart w:id="47" w:name="X010068c55f76942fb87a50811d0f7ee4b1eb2c3"/>
     <w:p>
       <w:pPr>
         <w:pStyle w:val="Heading2"/>
@@ -2109,18 +2306,18 @@
           <wp:inline>
             <wp:extent cx="5334000" cy="3708431"/>
             <wp:effectExtent b="0" l="0" r="0" t="0"/>
-            <wp:docPr descr="B_porosity_patterns" title="" id="33" name="Picture"/>
+            <wp:docPr descr="Effect of the porosity distribution pattern (UD, O, X, V, A), GPL kept uniform; pattern A acts as a thermal barrier." title="" id="42" name="Picture"/>
             <a:graphic>
               <a:graphicData uri="http://schemas.openxmlformats.org/drawingml/2006/picture">
                 <pic:pic>
                   <pic:nvPicPr>
-                    <pic:cNvPr descr="figures_ch4_bw/B_porosity_patterns.png" id="34" name="Picture"/>
+                    <pic:cNvPr descr="figures_ch4_bw/B_porosity_patterns.png" id="43" name="Picture"/>
                     <pic:cNvPicPr>
                       <a:picLocks noChangeArrowheads="1" noChangeAspect="1"/>
                     </pic:cNvPicPr>
                   </pic:nvPicPr>
                   <pic:blipFill>
-                    <a:blip r:embed="rId32"/>
+                    <a:blip r:embed="rId41"/>
                     <a:stretch>
                       <a:fillRect/>
                     </a:stretch>
@@ -2152,7 +2349,7 @@
         <w:pStyle w:val="ImageCaption"/>
       </w:pPr>
       <w:r>
-        <w:t xml:space="preserve">B_porosity_patterns</w:t>
+        <w:t xml:space="preserve">Effect of the porosity distribution pattern (UD, O, X, V, A), GPL kept uniform; pattern A acts as a thermal barrier.</w:t>
       </w:r>
     </w:p>
     <w:p>
@@ -2289,18 +2486,18 @@
           <wp:inline>
             <wp:extent cx="5334000" cy="3708431"/>
             <wp:effectExtent b="0" l="0" r="0" t="0"/>
-            <wp:docPr descr="E_porosity_level" title="" id="36" name="Picture"/>
+            <wp:docPr descr="Effect of the porosity level e_m3 = 0.9675 / 0.8604 / 0.7776 (light / moderate / heavy)." title="" id="45" name="Picture"/>
             <a:graphic>
               <a:graphicData uri="http://schemas.openxmlformats.org/drawingml/2006/picture">
                 <pic:pic>
                   <pic:nvPicPr>
-                    <pic:cNvPr descr="figures_ch4_bw/E_porosity_level.png" id="37" name="Picture"/>
+                    <pic:cNvPr descr="figures_ch4_bw/E_porosity_level.png" id="46" name="Picture"/>
                     <pic:cNvPicPr>
                       <a:picLocks noChangeArrowheads="1" noChangeAspect="1"/>
                     </pic:cNvPicPr>
                   </pic:nvPicPr>
                   <pic:blipFill>
-                    <a:blip r:embed="rId35"/>
+                    <a:blip r:embed="rId44"/>
                     <a:stretch>
                       <a:fillRect/>
                     </a:stretch>
@@ -2332,7 +2529,7 @@
         <w:pStyle w:val="ImageCaption"/>
       </w:pPr>
       <w:r>
-        <w:t xml:space="preserve">E_porosity_level</w:t>
+        <w:t xml:space="preserve">Effect of the porosity level e_m3 = 0.9675 / 0.8604 / 0.7776 (light / moderate / heavy).</w:t>
       </w:r>
     </w:p>
     <w:p>
@@ -2379,8 +2576,8 @@
         <w:t xml:space="preserve">loading.</w:t>
       </w:r>
     </w:p>
-    <w:bookmarkEnd w:id="38"/>
-    <w:bookmarkStart w:id="45" w:name="effect-of-the-gpl-weight-fraction"/>
+    <w:bookmarkEnd w:id="47"/>
+    <w:bookmarkStart w:id="54" w:name="effect-of-the-gpl-weight-fraction"/>
     <w:p>
       <w:pPr>
         <w:pStyle w:val="Heading2"/>
@@ -2398,18 +2595,18 @@
           <wp:inline>
             <wp:extent cx="5334000" cy="3708431"/>
             <wp:effectExtent b="0" l="0" r="0" t="0"/>
-            <wp:docPr descr="D_wt_low" title="" id="40" name="Picture"/>
+            <wp:docPr descr="Effect of the GPL weight fraction, low range W = 0.1 / 0.3 / 0.5 / 0.9 / 1.5 %." title="" id="49" name="Picture"/>
             <a:graphic>
               <a:graphicData uri="http://schemas.openxmlformats.org/drawingml/2006/picture">
                 <pic:pic>
                   <pic:nvPicPr>
-                    <pic:cNvPr descr="figures_ch4_bw/D_wt_low.png" id="41" name="Picture"/>
+                    <pic:cNvPr descr="figures_ch4_bw/D_wt_low.png" id="50" name="Picture"/>
                     <pic:cNvPicPr>
                       <a:picLocks noChangeArrowheads="1" noChangeAspect="1"/>
                     </pic:cNvPicPr>
                   </pic:nvPicPr>
                   <pic:blipFill>
-                    <a:blip r:embed="rId39"/>
+                    <a:blip r:embed="rId48"/>
                     <a:stretch>
                       <a:fillRect/>
                     </a:stretch>
@@ -2441,7 +2638,7 @@
         <w:pStyle w:val="ImageCaption"/>
       </w:pPr>
       <w:r>
-        <w:t xml:space="preserve">D_wt_low</w:t>
+        <w:t xml:space="preserve">Effect of the GPL weight fraction, low range W = 0.1 / 0.3 / 0.5 / 0.9 / 1.5 %.</w:t>
       </w:r>
     </w:p>
     <w:p>
@@ -2521,18 +2718,18 @@
           <wp:inline>
             <wp:extent cx="5334000" cy="3708431"/>
             <wp:effectExtent b="0" l="0" r="0" t="0"/>
-            <wp:docPr descr="D2_wt_high" title="" id="43" name="Picture"/>
+            <wp:docPr descr="Effect of the GPL weight fraction, high range W = 1 / 2 / 4 / 8 %; the thermal gain saturates while the stresses grow." title="" id="52" name="Picture"/>
             <a:graphic>
               <a:graphicData uri="http://schemas.openxmlformats.org/drawingml/2006/picture">
                 <pic:pic>
                   <pic:nvPicPr>
-                    <pic:cNvPr descr="figures_ch4_bw/D2_wt_high.png" id="44" name="Picture"/>
+                    <pic:cNvPr descr="figures_ch4_bw/D2_wt_high.png" id="53" name="Picture"/>
                     <pic:cNvPicPr>
                       <a:picLocks noChangeArrowheads="1" noChangeAspect="1"/>
                     </pic:cNvPicPr>
                   </pic:nvPicPr>
                   <pic:blipFill>
-                    <a:blip r:embed="rId42"/>
+                    <a:blip r:embed="rId51"/>
                     <a:stretch>
                       <a:fillRect/>
                     </a:stretch>
@@ -2564,7 +2761,7 @@
         <w:pStyle w:val="ImageCaption"/>
       </w:pPr>
       <w:r>
-        <w:t xml:space="preserve">D2_wt_high</w:t>
+        <w:t xml:space="preserve">Effect of the GPL weight fraction, high range W = 1 / 2 / 4 / 8 %; the thermal gain saturates while the stresses grow.</w:t>
       </w:r>
     </w:p>
     <w:p>
@@ -2635,8 +2832,8 @@
         <w:t xml:space="preserve">gain and the growth of the stresses.</w:t>
       </w:r>
     </w:p>
-    <w:bookmarkEnd w:id="45"/>
-    <w:bookmarkStart w:id="52" w:name="effect-of-the-gpl-aspect-ratios"/>
+    <w:bookmarkEnd w:id="54"/>
+    <w:bookmarkStart w:id="61" w:name="effect-of-the-gpl-aspect-ratios"/>
     <w:p>
       <w:pPr>
         <w:pStyle w:val="Heading2"/>
@@ -2692,18 +2889,18 @@
           <wp:inline>
             <wp:extent cx="5334000" cy="3708431"/>
             <wp:effectExtent b="0" l="0" r="0" t="0"/>
-            <wp:docPr descr="O_aspect_ab" title="" id="47" name="Picture"/>
+            <wp:docPr descr="Effect of the platelet length-to-width aspect ratio a/b = 1.0 / 1.67 / 2.67." title="" id="56" name="Picture"/>
             <a:graphic>
               <a:graphicData uri="http://schemas.openxmlformats.org/drawingml/2006/picture">
                 <pic:pic>
                   <pic:nvPicPr>
-                    <pic:cNvPr descr="figures_ch4_bw/O_aspect_ab.png" id="48" name="Picture"/>
+                    <pic:cNvPr descr="figures_ch4_bw/O_aspect_ab.png" id="57" name="Picture"/>
                     <pic:cNvPicPr>
                       <a:picLocks noChangeArrowheads="1" noChangeAspect="1"/>
                     </pic:cNvPicPr>
                   </pic:nvPicPr>
                   <pic:blipFill>
-                    <a:blip r:embed="rId46"/>
+                    <a:blip r:embed="rId55"/>
                     <a:stretch>
                       <a:fillRect/>
                     </a:stretch>
@@ -2735,7 +2932,7 @@
         <w:pStyle w:val="ImageCaption"/>
       </w:pPr>
       <w:r>
-        <w:t xml:space="preserve">O_aspect_ab</w:t>
+        <w:t xml:space="preserve">Effect of the platelet length-to-width aspect ratio a/b = 1.0 / 1.67 / 2.67.</w:t>
       </w:r>
     </w:p>
     <w:p>
@@ -2773,18 +2970,18 @@
           <wp:inline>
             <wp:extent cx="5334000" cy="3708431"/>
             <wp:effectExtent b="0" l="0" r="0" t="0"/>
-            <wp:docPr descr="P_aspect_bt" title="" id="50" name="Picture"/>
+            <wp:docPr descr="Effect of the platelet width-to-thickness aspect ratio b/t = 500 / 1000 / 2000." title="" id="59" name="Picture"/>
             <a:graphic>
               <a:graphicData uri="http://schemas.openxmlformats.org/drawingml/2006/picture">
                 <pic:pic>
                   <pic:nvPicPr>
-                    <pic:cNvPr descr="figures_ch4_bw/P_aspect_bt.png" id="51" name="Picture"/>
+                    <pic:cNvPr descr="figures_ch4_bw/P_aspect_bt.png" id="60" name="Picture"/>
                     <pic:cNvPicPr>
                       <a:picLocks noChangeArrowheads="1" noChangeAspect="1"/>
                     </pic:cNvPicPr>
                   </pic:nvPicPr>
                   <pic:blipFill>
-                    <a:blip r:embed="rId49"/>
+                    <a:blip r:embed="rId58"/>
                     <a:stretch>
                       <a:fillRect/>
                     </a:stretch>
@@ -2816,7 +3013,7 @@
         <w:pStyle w:val="ImageCaption"/>
       </w:pPr>
       <w:r>
-        <w:t xml:space="preserve">P_aspect_bt</w:t>
+        <w:t xml:space="preserve">Effect of the platelet width-to-thickness aspect ratio b/t = 500 / 1000 / 2000.</w:t>
       </w:r>
     </w:p>
     <w:p>
@@ -2881,8 +3078,8 @@
         <w:t xml:space="preserve">properties.</w:t>
       </w:r>
     </w:p>
-    <w:bookmarkEnd w:id="52"/>
-    <w:bookmarkStart w:id="56" w:name="Xa0a4f2ec79457097fc13ef5bb4a7f53f3d50b31"/>
+    <w:bookmarkEnd w:id="61"/>
+    <w:bookmarkStart w:id="65" w:name="Xa0a4f2ec79457097fc13ef5bb4a7f53f3d50b31"/>
     <w:p>
       <w:pPr>
         <w:pStyle w:val="Heading2"/>
@@ -2900,18 +3097,18 @@
           <wp:inline>
             <wp:extent cx="5334000" cy="3708431"/>
             <wp:effectExtent b="0" l="0" r="0" t="0"/>
-            <wp:docPr descr="C_relaxation" title="" id="54" name="Picture"/>
+            <wp:docPr descr="Effect of the relaxation time: Fourier (tau=0) and Lord-Shulman tau = 0.04 / 0.15 / 0.44 / 0.87; overshoot grows with tau*." title="" id="63" name="Picture"/>
             <a:graphic>
               <a:graphicData uri="http://schemas.openxmlformats.org/drawingml/2006/picture">
                 <pic:pic>
                   <pic:nvPicPr>
-                    <pic:cNvPr descr="figures_ch4_bw/C_relaxation.png" id="55" name="Picture"/>
+                    <pic:cNvPr descr="figures_ch4_bw/C_relaxation.png" id="64" name="Picture"/>
                     <pic:cNvPicPr>
                       <a:picLocks noChangeArrowheads="1" noChangeAspect="1"/>
                     </pic:cNvPicPr>
                   </pic:nvPicPr>
                   <pic:blipFill>
-                    <a:blip r:embed="rId53"/>
+                    <a:blip r:embed="rId62"/>
                     <a:stretch>
                       <a:fillRect/>
                     </a:stretch>
@@ -2943,7 +3140,20 @@
         <w:pStyle w:val="ImageCaption"/>
       </w:pPr>
       <w:r>
-        <w:t xml:space="preserve">C_relaxation</w:t>
+        <w:t xml:space="preserve">Effect of the relaxation time: Fourier (tau</w:t>
+      </w:r>
+      <w:r>
+        <w:rPr>
+          <w:i/>
+          <w:iCs/>
+        </w:rPr>
+        <w:t xml:space="preserve">=0) and Lord-Shulman tau</w:t>
+      </w:r>
+      <w:r>
+        <w:t xml:space="preserve"> </w:t>
+      </w:r>
+      <w:r>
+        <w:t xml:space="preserve">= 0.04 / 0.15 / 0.44 / 0.87; overshoot grows with tau*.</w:t>
       </w:r>
     </w:p>
     <w:p>
@@ -3054,8 +3264,8 @@
         <w:t xml:space="preserve">employing generalized thermoelasticity in short-time analyses [3].</w:t>
       </w:r>
     </w:p>
-    <w:bookmarkEnd w:id="56"/>
-    <w:bookmarkStart w:id="60" w:name="effect-of-the-end-supports"/>
+    <w:bookmarkEnd w:id="65"/>
+    <w:bookmarkStart w:id="69" w:name="effect-of-the-end-supports"/>
     <w:p>
       <w:pPr>
         <w:pStyle w:val="Heading2"/>
@@ -3073,18 +3283,18 @@
           <wp:inline>
             <wp:extent cx="5334000" cy="3708431"/>
             <wp:effectExtent b="0" l="0" r="0" t="0"/>
-            <wp:docPr descr="F_end_BC" title="" id="58" name="Picture"/>
+            <wp:docPr descr="Effect of the end supports: simply supported (S-S), mixed (S-C) and clamped (C-C)." title="" id="67" name="Picture"/>
             <a:graphic>
               <a:graphicData uri="http://schemas.openxmlformats.org/drawingml/2006/picture">
                 <pic:pic>
                   <pic:nvPicPr>
-                    <pic:cNvPr descr="figures_ch4_bw/F_end_BC.png" id="59" name="Picture"/>
+                    <pic:cNvPr descr="figures_ch4_bw/F_end_BC.png" id="68" name="Picture"/>
                     <pic:cNvPicPr>
                       <a:picLocks noChangeArrowheads="1" noChangeAspect="1"/>
                     </pic:cNvPicPr>
                   </pic:nvPicPr>
                   <pic:blipFill>
-                    <a:blip r:embed="rId57"/>
+                    <a:blip r:embed="rId66"/>
                     <a:stretch>
                       <a:fillRect/>
                     </a:stretch>
@@ -3116,7 +3326,7 @@
         <w:pStyle w:val="ImageCaption"/>
       </w:pPr>
       <w:r>
-        <w:t xml:space="preserve">F_end_BC</w:t>
+        <w:t xml:space="preserve">Effect of the end supports: simply supported (S-S), mixed (S-C) and clamped (C-C).</w:t>
       </w:r>
     </w:p>
     <w:p>
@@ -3225,8 +3435,8 @@
         <w:t xml:space="preserve">the characteristic response of the structure.</w:t>
       </w:r>
     </w:p>
-    <w:bookmarkEnd w:id="60"/>
-    <w:bookmarkStart w:id="64" w:name="effect-of-the-internal-pressure"/>
+    <w:bookmarkEnd w:id="69"/>
+    <w:bookmarkStart w:id="73" w:name="effect-of-the-internal-pressure"/>
     <w:p>
       <w:pPr>
         <w:pStyle w:val="Heading2"/>
@@ -3276,18 +3486,18 @@
           <wp:inline>
             <wp:extent cx="5334000" cy="3297867"/>
             <wp:effectExtent b="0" l="0" r="0" t="0"/>
-            <wp:docPr descr="G_pressure" title="" id="62" name="Picture"/>
+            <wp:docPr descr="Effect of the internal pressure P_i = 0 / 10 / 50 / 100 MPa; the mechanical response grows linearly." title="" id="71" name="Picture"/>
             <a:graphic>
               <a:graphicData uri="http://schemas.openxmlformats.org/drawingml/2006/picture">
                 <pic:pic>
                   <pic:nvPicPr>
-                    <pic:cNvPr descr="figures_ch4_bw/G_pressure.png" id="63" name="Picture"/>
+                    <pic:cNvPr descr="figures_ch4_bw/G_pressure.png" id="72" name="Picture"/>
                     <pic:cNvPicPr>
                       <a:picLocks noChangeArrowheads="1" noChangeAspect="1"/>
                     </pic:cNvPicPr>
                   </pic:nvPicPr>
                   <pic:blipFill>
-                    <a:blip r:embed="rId61"/>
+                    <a:blip r:embed="rId70"/>
                     <a:stretch>
                       <a:fillRect/>
                     </a:stretch>
@@ -3319,7 +3529,7 @@
         <w:pStyle w:val="ImageCaption"/>
       </w:pPr>
       <w:r>
-        <w:t xml:space="preserve">G_pressure</w:t>
+        <w:t xml:space="preserve">Effect of the internal pressure P_i = 0 / 10 / 50 / 100 MPa; the mechanical response grows linearly.</w:t>
       </w:r>
     </w:p>
     <w:p>
@@ -3414,8 +3624,8 @@
         <w:t xml:space="preserve">consistent with the loading boundary condition.</w:t>
       </w:r>
     </w:p>
-    <w:bookmarkEnd w:id="64"/>
-    <w:bookmarkStart w:id="68" w:name="X85283b7d337430b612aa9d28b66a5c2b37b0441"/>
+    <w:bookmarkEnd w:id="73"/>
+    <w:bookmarkStart w:id="77" w:name="X85283b7d337430b612aa9d28b66a5c2b37b0441"/>
     <w:p>
       <w:pPr>
         <w:pStyle w:val="Heading2"/>
@@ -3433,18 +3643,18 @@
           <wp:inline>
             <wp:extent cx="5334000" cy="3708431"/>
             <wp:effectExtent b="0" l="0" r="0" t="0"/>
-            <wp:docPr descr="Q_length" title="" id="66" name="Picture"/>
+            <wp:docPr descr="Effect of the cylinder length l = 1 / 2.1 / 5 / 10 m and the approach to the long-cylinder limit." title="" id="75" name="Picture"/>
             <a:graphic>
               <a:graphicData uri="http://schemas.openxmlformats.org/drawingml/2006/picture">
                 <pic:pic>
                   <pic:nvPicPr>
-                    <pic:cNvPr descr="figures_ch4_bw/Q_length.png" id="67" name="Picture"/>
+                    <pic:cNvPr descr="figures_ch4_bw/Q_length.png" id="76" name="Picture"/>
                     <pic:cNvPicPr>
                       <a:picLocks noChangeArrowheads="1" noChangeAspect="1"/>
                     </pic:cNvPicPr>
                   </pic:nvPicPr>
                   <pic:blipFill>
-                    <a:blip r:embed="rId65"/>
+                    <a:blip r:embed="rId74"/>
                     <a:stretch>
                       <a:fillRect/>
                     </a:stretch>
@@ -3476,7 +3686,7 @@
         <w:pStyle w:val="ImageCaption"/>
       </w:pPr>
       <w:r>
-        <w:t xml:space="preserve">Q_length</w:t>
+        <w:t xml:space="preserve">Effect of the cylinder length l = 1 / 2.1 / 5 / 10 m and the approach to the long-cylinder limit.</w:t>
       </w:r>
     </w:p>
     <w:p>
@@ -3553,8 +3763,8 @@
         <w:t xml:space="preserve">the mechanical effects of the two ends are not felt.</w:t>
       </w:r>
     </w:p>
-    <w:bookmarkEnd w:id="68"/>
-    <w:bookmarkStart w:id="75" w:name="X81eac57fafad65e87a08e7444e513955d528acd"/>
+    <w:bookmarkEnd w:id="77"/>
+    <w:bookmarkStart w:id="84" w:name="X81eac57fafad65e87a08e7444e513955d528acd"/>
     <w:p>
       <w:pPr>
         <w:pStyle w:val="Heading2"/>
@@ -3610,18 +3820,18 @@
           <wp:inline>
             <wp:extent cx="5334000" cy="3982720"/>
             <wp:effectExtent b="0" l="0" r="0" t="0"/>
-            <wp:docPr descr="matrix25_Tstar" title="" id="70" name="Picture"/>
+            <wp:docPr descr="Full 25-case GPL x porosity matrix: through-wall dimensionless temperature T*(xi) for every pattern pair; porosity A is a universal thermal barrier." title="" id="79" name="Picture"/>
             <a:graphic>
               <a:graphicData uri="http://schemas.openxmlformats.org/drawingml/2006/picture">
                 <pic:pic>
                   <pic:nvPicPr>
-                    <pic:cNvPr descr="figures_ch4_bw/matrix25_Tstar.png" id="71" name="Picture"/>
+                    <pic:cNvPr descr="figures_ch4_bw/matrix25_Tstar.png" id="80" name="Picture"/>
                     <pic:cNvPicPr>
                       <a:picLocks noChangeArrowheads="1" noChangeAspect="1"/>
                     </pic:cNvPicPr>
                   </pic:nvPicPr>
                   <pic:blipFill>
-                    <a:blip r:embed="rId69"/>
+                    <a:blip r:embed="rId78"/>
                     <a:stretch>
                       <a:fillRect/>
                     </a:stretch>
@@ -3653,7 +3863,7 @@
         <w:pStyle w:val="ImageCaption"/>
       </w:pPr>
       <w:r>
-        <w:t xml:space="preserve">matrix25_Tstar</w:t>
+        <w:t xml:space="preserve">Full 25-case GPL x porosity matrix: through-wall dimensionless temperature T*(xi) for every pattern pair; porosity A is a universal thermal barrier.</w:t>
       </w:r>
     </w:p>
     <w:p>
@@ -3742,18 +3952,18 @@
           <wp:inline>
             <wp:extent cx="5334000" cy="3982720"/>
             <wp:effectExtent b="0" l="0" r="0" t="0"/>
-            <wp:docPr descr="matrix25_Sigma_thth" title="" id="73" name="Picture"/>
+            <wp:docPr descr="Full 25-case GPL x porosity matrix: hoop-stress profile Sigma_thth(xi) for every pattern pair." title="" id="82" name="Picture"/>
             <a:graphic>
               <a:graphicData uri="http://schemas.openxmlformats.org/drawingml/2006/picture">
                 <pic:pic>
                   <pic:nvPicPr>
-                    <pic:cNvPr descr="figures_ch4_bw/matrix25_Sigma_thth.png" id="74" name="Picture"/>
+                    <pic:cNvPr descr="figures_ch4_bw/matrix25_Sigma_thth.png" id="83" name="Picture"/>
                     <pic:cNvPicPr>
                       <a:picLocks noChangeArrowheads="1" noChangeAspect="1"/>
                     </pic:cNvPicPr>
                   </pic:nvPicPr>
                   <pic:blipFill>
-                    <a:blip r:embed="rId72"/>
+                    <a:blip r:embed="rId81"/>
                     <a:stretch>
                       <a:fillRect/>
                     </a:stretch>
@@ -3785,7 +3995,7 @@
         <w:pStyle w:val="ImageCaption"/>
       </w:pPr>
       <w:r>
-        <w:t xml:space="preserve">matrix25_Sigma_thth</w:t>
+        <w:t xml:space="preserve">Full 25-case GPL x porosity matrix: hoop-stress profile Sigma_thth(xi) for every pattern pair.</w:t>
       </w:r>
     </w:p>
     <w:p>
@@ -3886,8 +4096,8 @@
         <w:t xml:space="preserve">this work.</w:t>
       </w:r>
     </w:p>
-    <w:bookmarkEnd w:id="75"/>
-    <w:bookmarkStart w:id="79" w:name="effect-of-the-coupling-of-the-equations"/>
+    <w:bookmarkEnd w:id="84"/>
+    <w:bookmarkStart w:id="88" w:name="effect-of-the-coupling-of-the-equations"/>
     <w:p>
       <w:pPr>
         <w:pStyle w:val="Heading2"/>
@@ -3905,18 +4115,18 @@
           <wp:inline>
             <wp:extent cx="5334000" cy="3297867"/>
             <wp:effectExtent b="0" l="0" r="0" t="0"/>
-            <wp:docPr descr="I_coupling" title="" id="77" name="Picture"/>
+            <wp:docPr descr="Effect of thermo-mechanical coupling: fully coupled versus uncoupled energy equation." title="" id="86" name="Picture"/>
             <a:graphic>
               <a:graphicData uri="http://schemas.openxmlformats.org/drawingml/2006/picture">
                 <pic:pic>
                   <pic:nvPicPr>
-                    <pic:cNvPr descr="figures_ch4_bw/I_coupling.png" id="78" name="Picture"/>
+                    <pic:cNvPr descr="figures_ch4_bw/I_coupling.png" id="87" name="Picture"/>
                     <pic:cNvPicPr>
                       <a:picLocks noChangeArrowheads="1" noChangeAspect="1"/>
                     </pic:cNvPicPr>
                   </pic:nvPicPr>
                   <pic:blipFill>
-                    <a:blip r:embed="rId76"/>
+                    <a:blip r:embed="rId85"/>
                     <a:stretch>
                       <a:fillRect/>
                     </a:stretch>
@@ -3948,7 +4158,7 @@
         <w:pStyle w:val="ImageCaption"/>
       </w:pPr>
       <w:r>
-        <w:t xml:space="preserve">I_coupling</w:t>
+        <w:t xml:space="preserve">Effect of thermo-mechanical coupling: fully coupled versus uncoupled energy equation.</w:t>
       </w:r>
     </w:p>
     <w:p>
@@ -4013,8 +4223,8 @@
         <w:t xml:space="preserve">should be solved when the wave signature matters, despite its higher cost.</w:t>
       </w:r>
     </w:p>
-    <w:bookmarkEnd w:id="79"/>
-    <w:bookmarkStart w:id="83" w:name="Xb006e1994140170e308a706d86645cac631d9cb"/>
+    <w:bookmarkEnd w:id="88"/>
+    <w:bookmarkStart w:id="92" w:name="Xb006e1994140170e308a706d86645cac631d9cb"/>
     <w:p>
       <w:pPr>
         <w:pStyle w:val="Heading2"/>
@@ -4032,18 +4242,18 @@
           <wp:inline>
             <wp:extent cx="5334000" cy="3708431"/>
             <wp:effectExtent b="0" l="0" r="0" t="0"/>
-            <wp:docPr descr="J_convection" title="" id="81" name="Picture"/>
+            <wp:docPr descr="Effect of the outer-surface convection coefficient h_c = 10 / 100 / 1000 W/m2K." title="" id="90" name="Picture"/>
             <a:graphic>
               <a:graphicData uri="http://schemas.openxmlformats.org/drawingml/2006/picture">
                 <pic:pic>
                   <pic:nvPicPr>
-                    <pic:cNvPr descr="figures_ch4_bw/J_convection.png" id="82" name="Picture"/>
+                    <pic:cNvPr descr="figures_ch4_bw/J_convection.png" id="91" name="Picture"/>
                     <pic:cNvPicPr>
                       <a:picLocks noChangeArrowheads="1" noChangeAspect="1"/>
                     </pic:cNvPicPr>
                   </pic:nvPicPr>
                   <pic:blipFill>
-                    <a:blip r:embed="rId80"/>
+                    <a:blip r:embed="rId89"/>
                     <a:stretch>
                       <a:fillRect/>
                     </a:stretch>
@@ -4075,7 +4285,7 @@
         <w:pStyle w:val="ImageCaption"/>
       </w:pPr>
       <w:r>
-        <w:t xml:space="preserve">J_convection</w:t>
+        <w:t xml:space="preserve">Effect of the outer-surface convection coefficient h_c = 10 / 100 / 1000 W/m2K.</w:t>
       </w:r>
     </w:p>
     <w:p>
@@ -4140,8 +4350,8 @@
         <w:t xml:space="preserve">distinguished in design.</w:t>
       </w:r>
     </w:p>
-    <w:bookmarkEnd w:id="83"/>
-    <w:bookmarkStart w:id="87" w:name="effect-of-the-wall-thickness"/>
+    <w:bookmarkEnd w:id="92"/>
+    <w:bookmarkStart w:id="96" w:name="effect-of-the-wall-thickness"/>
     <w:p>
       <w:pPr>
         <w:pStyle w:val="Heading2"/>
@@ -4159,18 +4369,18 @@
           <wp:inline>
             <wp:extent cx="5334000" cy="3708431"/>
             <wp:effectExtent b="0" l="0" r="0" t="0"/>
-            <wp:docPr descr="K_thickness" title="" id="85" name="Picture"/>
+            <wp:docPr descr="Effect of the wall thickness, radius ratio R_o/R_i = 1.25 / 1.5 / 2.0 (inner radius fixed)." title="" id="94" name="Picture"/>
             <a:graphic>
               <a:graphicData uri="http://schemas.openxmlformats.org/drawingml/2006/picture">
                 <pic:pic>
                   <pic:nvPicPr>
-                    <pic:cNvPr descr="figures_ch4_bw/K_thickness.png" id="86" name="Picture"/>
+                    <pic:cNvPr descr="figures_ch4_bw/K_thickness.png" id="95" name="Picture"/>
                     <pic:cNvPicPr>
                       <a:picLocks noChangeArrowheads="1" noChangeAspect="1"/>
                     </pic:cNvPicPr>
                   </pic:nvPicPr>
                   <pic:blipFill>
-                    <a:blip r:embed="rId84"/>
+                    <a:blip r:embed="rId93"/>
                     <a:stretch>
                       <a:fillRect/>
                     </a:stretch>
@@ -4202,7 +4412,7 @@
         <w:pStyle w:val="ImageCaption"/>
       </w:pPr>
       <w:r>
-        <w:t xml:space="preserve">K_thickness</w:t>
+        <w:t xml:space="preserve">Effect of the wall thickness, radius ratio R_o/R_i = 1.25 / 1.5 / 2.0 (inner radius fixed).</w:t>
       </w:r>
     </w:p>
     <w:p>
@@ -4285,8 +4495,8 @@
         <w:t xml:space="preserve">against a large, mildly stressed but strongly compressive thick wall.</w:t>
       </w:r>
     </w:p>
-    <w:bookmarkEnd w:id="87"/>
-    <w:bookmarkStart w:id="91" w:name="response-to-a-gaussian-thermal-shock"/>
+    <w:bookmarkEnd w:id="96"/>
+    <w:bookmarkStart w:id="100" w:name="response-to-a-gaussian-thermal-shock"/>
     <w:p>
       <w:pPr>
         <w:pStyle w:val="Heading2"/>
@@ -4304,18 +4514,18 @@
           <wp:inline>
             <wp:extent cx="5334000" cy="3297867"/>
             <wp:effectExtent b="0" l="0" r="0" t="0"/>
-            <wp:docPr descr="M_gauss_shock" title="" id="89" name="Picture"/>
+            <wp:docPr descr="Response to a Gaussian thermal shock: Lord-Shulman versus Fourier; the LS pulse arrives later, stronger and persists." title="" id="98" name="Picture"/>
             <a:graphic>
               <a:graphicData uri="http://schemas.openxmlformats.org/drawingml/2006/picture">
                 <pic:pic>
                   <pic:nvPicPr>
-                    <pic:cNvPr descr="figures_ch4_bw/M_gauss_shock.png" id="90" name="Picture"/>
+                    <pic:cNvPr descr="figures_ch4_bw/M_gauss_shock.png" id="99" name="Picture"/>
                     <pic:cNvPicPr>
                       <a:picLocks noChangeArrowheads="1" noChangeAspect="1"/>
                     </pic:cNvPicPr>
                   </pic:nvPicPr>
                   <pic:blipFill>
-                    <a:blip r:embed="rId88"/>
+                    <a:blip r:embed="rId97"/>
                     <a:stretch>
                       <a:fillRect/>
                     </a:stretch>
@@ -4347,7 +4557,7 @@
         <w:pStyle w:val="ImageCaption"/>
       </w:pPr>
       <w:r>
-        <w:t xml:space="preserve">M_gauss_shock</w:t>
+        <w:t xml:space="preserve">Response to a Gaussian thermal shock: Lord-Shulman versus Fourier; the LS pulse arrives later, stronger and persists.</w:t>
       </w:r>
     </w:p>
     <w:p>
@@ -4430,8 +4640,8 @@
         <w:t xml:space="preserve">of the shock — a strong argument in favor of the generalized theory.</w:t>
       </w:r>
     </w:p>
-    <w:bookmarkEnd w:id="91"/>
-    <w:bookmarkStart w:id="92" w:name="comparison-of-time-integration-methods"/>
+    <w:bookmarkEnd w:id="100"/>
+    <w:bookmarkStart w:id="101" w:name="comparison-of-time-integration-methods"/>
     <w:p>
       <w:pPr>
         <w:pStyle w:val="Heading2"/>
@@ -4800,8 +5010,8 @@
         <w:t xml:space="preserve">method for all production runs of this thesis.</w:t>
       </w:r>
     </w:p>
-    <w:bookmarkEnd w:id="92"/>
-    <w:bookmarkStart w:id="93" w:name="X9c9188b738b4478e05baa4d1b661521d9ddb445"/>
+    <w:bookmarkEnd w:id="101"/>
+    <w:bookmarkStart w:id="102" w:name="X9c9188b738b4478e05baa4d1b661521d9ddb445"/>
     <w:p>
       <w:pPr>
         <w:pStyle w:val="Heading2"/>
@@ -4914,8 +5124,8 @@
         <w:t xml:space="preserve">work over comparable previous studies.</w:t>
       </w:r>
     </w:p>
-    <w:bookmarkEnd w:id="93"/>
-    <w:bookmarkStart w:id="97" w:name="X98f2e98b83d46383dd6148158741cac70debee7"/>
+    <w:bookmarkEnd w:id="102"/>
+    <w:bookmarkStart w:id="106" w:name="X98f2e98b83d46383dd6148158741cac70debee7"/>
     <w:p>
       <w:pPr>
         <w:pStyle w:val="Heading2"/>
@@ -4933,18 +5143,18 @@
           <wp:inline>
             <wp:extent cx="5334000" cy="3297867"/>
             <wp:effectExtent b="0" l="0" r="0" t="0"/>
-            <wp:docPr descr="T3_theories" title="" id="95" name="Picture"/>
+            <wp:docPr descr="Comparison of the generalized thermoelasticity theories: Fourier / Lord-Shulman / dual-phase-lag / Green-Naghdi III." title="" id="104" name="Picture"/>
             <a:graphic>
               <a:graphicData uri="http://schemas.openxmlformats.org/drawingml/2006/picture">
                 <pic:pic>
                   <pic:nvPicPr>
-                    <pic:cNvPr descr="figures_ch4_bw/T3_theories.png" id="96" name="Picture"/>
+                    <pic:cNvPr descr="figures_ch4_bw/T3_theories.png" id="105" name="Picture"/>
                     <pic:cNvPicPr>
                       <a:picLocks noChangeArrowheads="1" noChangeAspect="1"/>
                     </pic:cNvPicPr>
                   </pic:nvPicPr>
                   <pic:blipFill>
-                    <a:blip r:embed="rId94"/>
+                    <a:blip r:embed="rId103"/>
                     <a:stretch>
                       <a:fillRect/>
                     </a:stretch>
@@ -4976,7 +5186,7 @@
         <w:pStyle w:val="ImageCaption"/>
       </w:pPr>
       <w:r>
-        <w:t xml:space="preserve">T3_theories</w:t>
+        <w:t xml:space="preserve">Comparison of the generalized thermoelasticity theories: Fourier / Lord-Shulman / dual-phase-lag / Green-Naghdi III.</w:t>
       </w:r>
     </w:p>
     <w:p>
@@ -5077,8 +5287,8 @@
         <w:t xml:space="preserve">contributions of this research.</w:t>
       </w:r>
     </w:p>
-    <w:bookmarkEnd w:id="97"/>
-    <w:bookmarkStart w:id="98" w:name="chapter-summary"/>
+    <w:bookmarkEnd w:id="106"/>
+    <w:bookmarkStart w:id="107" w:name="chapter-summary"/>
     <w:p>
       <w:pPr>
         <w:pStyle w:val="Heading2"/>
@@ -5365,8 +5575,8 @@
         <w:t xml:space="preserve">theories diverge for this class of structures.</w:t>
       </w:r>
     </w:p>
-    <w:bookmarkEnd w:id="98"/>
-    <w:bookmarkEnd w:id="99"/>
+    <w:bookmarkEnd w:id="107"/>
+    <w:bookmarkEnd w:id="108"/>
     <w:sectPr>
       <w:footnotePr>
         <w:numRestart w:val="eachSect"/>

</xml_diff>

<commit_message>
Ch4 R4 Prom.4 round 2: Rezaei caption format + 3 fixes
- figure captions rewritten in Bahram Rezaei's thesis format: bare figure
  number above, full "Figure 4-N / shekl 4-N: <description> [<parameters>]"
  caption below with the case parameters in brackets (EN + FA)
- bench1 legend "Present (claude_R2)" -> "Present"
- removed tau*=0.87 from the relaxation figure (4-14) and its text (EN + FA)
- removed the top title from the 25-case matrix figures
- figures re-rendered; all 4 docx rebuilt (24 figures each)

Co-Authored-By: Claude Opus 4.8 (1M context) <noreply@anthropic.com>
</commit_message>
<xml_diff>
--- a/claude/thesis_chapter/RESULTS_CHAPTER_EN_R4_bw.docx
+++ b/claude/thesis_chapter/RESULTS_CHAPTER_EN_R4_bw.docx
@@ -689,7 +689,7 @@
           <w:b/>
           <w:bCs/>
         </w:rPr>
-        <w:t xml:space="preserve">Figure 4-1.</w:t>
+        <w:t xml:space="preserve">4-1</w:t>
       </w:r>
     </w:p>
     <w:p>
@@ -701,7 +701,7 @@
           <wp:inline>
             <wp:extent cx="5334000" cy="2079671"/>
             <wp:effectExtent b="0" l="0" r="0" t="0"/>
-            <wp:docPr descr="Radial-node convergence per layer (N_z=11, N_L=7); the field quantities are converged from N_r=7." title="" id="12" name="Picture"/>
+            <wp:docPr descr="Figure 4-1: Radial-node convergence — hoop-stress and temperature profiles for N_r = 7…15 [N_z=11, N_L=7, W_GPL=0.3%, e_m3=0.8604, τ*=0.15, P_i=50 MPa, simply supported]" title="" id="12" name="Picture"/>
             <a:graphic>
               <a:graphicData uri="http://schemas.openxmlformats.org/drawingml/2006/picture">
                 <pic:pic>
@@ -744,7 +744,7 @@
         <w:pStyle w:val="ImageCaption"/>
       </w:pPr>
       <w:r>
-        <w:t xml:space="preserve">Radial-node convergence per layer (N_z=11, N_L=7); the field quantities are converged from N_r=7.</w:t>
+        <w:t xml:space="preserve">Figure 4-1: Radial-node convergence — hoop-stress and temperature profiles for N_r = 7…15 [N_z=11, N_L=7, W_GPL=0.3%, e_m3=0.8604, τ*=0.15, P_i=50 MPa, simply supported]</w:t>
       </w:r>
     </w:p>
     <w:p>
@@ -1126,7 +1126,7 @@
           <w:b/>
           <w:bCs/>
         </w:rPr>
-        <w:t xml:space="preserve">Figure 4-2.</w:t>
+        <w:t xml:space="preserve">4-2</w:t>
       </w:r>
     </w:p>
     <w:p>
@@ -1138,7 +1138,7 @@
           <wp:inline>
             <wp:extent cx="5334000" cy="2079671"/>
             <wp:effectExtent b="0" l="0" r="0" t="0"/>
-            <wp:docPr descr="Axial-node convergence, the binding direction (N_r=15, N_L=7); N_z=5 gives a 9.4% error, with the clean serial cost." title="" id="16" name="Picture"/>
+            <wp:docPr descr="Figure 4-2: Axial-node convergence — profiles for N_z = 5…15 [N_r=15, N_L=7, W_GPL=0.3%, e_m3=0.8604, τ*=0.15, P_i=50 MPa, simply supported]" title="" id="16" name="Picture"/>
             <a:graphic>
               <a:graphicData uri="http://schemas.openxmlformats.org/drawingml/2006/picture">
                 <pic:pic>
@@ -1181,7 +1181,7 @@
         <w:pStyle w:val="ImageCaption"/>
       </w:pPr>
       <w:r>
-        <w:t xml:space="preserve">Axial-node convergence, the binding direction (N_r=15, N_L=7); N_z=5 gives a 9.4% error, with the clean serial cost.</w:t>
+        <w:t xml:space="preserve">Figure 4-2: Axial-node convergence — profiles for N_z = 5…15 [N_r=15, N_L=7, W_GPL=0.3%, e_m3=0.8604, τ*=0.15, P_i=50 MPa, simply supported]</w:t>
       </w:r>
     </w:p>
     <w:p>
@@ -1615,7 +1615,7 @@
           <w:b/>
           <w:bCs/>
         </w:rPr>
-        <w:t xml:space="preserve">Figure 4-3.</w:t>
+        <w:t xml:space="preserve">4-3</w:t>
       </w:r>
     </w:p>
     <w:p>
@@ -1627,7 +1627,7 @@
           <wp:inline>
             <wp:extent cx="5334000" cy="2079671"/>
             <wp:effectExtent b="0" l="0" r="0" t="0"/>
-            <wp:docPr descr="Layer-count convergence: hoop-stress and temperature profiles, L2 error and cost vs number of layers N_L (N_r=15, N_z=11)." title="" id="20" name="Picture"/>
+            <wp:docPr descr="Figure 4-3: Layer convergence — profiles for N_L = 3…15 [N_r=15, N_z=11, W_GPL=0.3%, e_m3=0.8604, τ*=0.15, P_i=50 MPa, simply supported]" title="" id="20" name="Picture"/>
             <a:graphic>
               <a:graphicData uri="http://schemas.openxmlformats.org/drawingml/2006/picture">
                 <pic:pic>
@@ -1670,7 +1670,7 @@
         <w:pStyle w:val="ImageCaption"/>
       </w:pPr>
       <w:r>
-        <w:t xml:space="preserve">Layer-count convergence: hoop-stress and temperature profiles, L2 error and cost vs number of layers N_L (N_r=15, N_z=11).</w:t>
+        <w:t xml:space="preserve">Figure 4-3: Layer convergence — profiles for N_L = 3…15 [N_r=15, N_z=11, W_GPL=0.3%, e_m3=0.8604, τ*=0.15, P_i=50 MPa, simply supported]</w:t>
       </w:r>
     </w:p>
     <w:p>
@@ -2591,7 +2591,7 @@
           <w:b/>
           <w:bCs/>
         </w:rPr>
-        <w:t xml:space="preserve">Figure 4-4.</w:t>
+        <w:t xml:space="preserve">4-4</w:t>
       </w:r>
     </w:p>
     <w:p>
@@ -2601,9 +2601,9 @@
       <w:r>
         <w:drawing>
           <wp:inline>
-            <wp:extent cx="5334000" cy="3810348"/>
+            <wp:extent cx="5334000" cy="3812786"/>
             <wp:effectExtent b="0" l="0" r="0" t="0"/>
-            <wp:docPr descr="Verification (mechanical): dimensionless inner-surface radial displacement of the present solver against Malekzadeh &amp; Heydarpour (2012) and an independent ANSYS solution." title="" id="26" name="Picture"/>
+            <wp:docPr descr="Figure 4-4: Verification (mechanical) — inner-surface dimensionless radial displacement of the present solver against Malekzadeh &amp; Heydarpour (2012) and an independent ANSYS solution [thick cylinder under internal pressure step]" title="" id="26" name="Picture"/>
             <a:graphic>
               <a:graphicData uri="http://schemas.openxmlformats.org/drawingml/2006/picture">
                 <pic:pic>
@@ -2622,7 +2622,7 @@
                   <pic:spPr bwMode="auto">
                     <a:xfrm>
                       <a:off x="0" y="0"/>
-                      <a:ext cx="5334000" cy="3810348"/>
+                      <a:ext cx="5334000" cy="3812786"/>
                     </a:xfrm>
                     <a:prstGeom prst="rect">
                       <a:avLst/>
@@ -2646,7 +2646,7 @@
         <w:pStyle w:val="ImageCaption"/>
       </w:pPr>
       <w:r>
-        <w:t xml:space="preserve">Verification (mechanical): dimensionless inner-surface radial displacement of the present solver against Malekzadeh &amp; Heydarpour (2012) and an independent ANSYS solution.</w:t>
+        <w:t xml:space="preserve">Figure 4-4: Verification (mechanical) — inner-surface dimensionless radial displacement of the present solver against Malekzadeh &amp; Heydarpour (2012) and an independent ANSYS solution [thick cylinder under internal pressure step]</w:t>
       </w:r>
     </w:p>
     <w:p>
@@ -2658,7 +2658,7 @@
           <w:b/>
           <w:bCs/>
         </w:rPr>
-        <w:t xml:space="preserve">Figure 4-5.</w:t>
+        <w:t xml:space="preserve">4-5</w:t>
       </w:r>
     </w:p>
     <w:p>
@@ -2670,7 +2670,7 @@
           <wp:inline>
             <wp:extent cx="5334000" cy="3697845"/>
             <wp:effectExtent b="0" l="0" r="0" t="0"/>
-            <wp:docPr descr="Verification (thermal): transient temperature profiles from the present DQM+Newmark solver against the exact Bessel-series solution at t = 2, 10 and 40 s." title="" id="29" name="Picture"/>
+            <wp:docPr descr="Figure 4-5: Verification (thermal) — transient temperature profiles of the present DQM+Newmark solver against the exact Bessel-series solution at t = 2, 10 and 40 s" title="" id="29" name="Picture"/>
             <a:graphic>
               <a:graphicData uri="http://schemas.openxmlformats.org/drawingml/2006/picture">
                 <pic:pic>
@@ -2713,7 +2713,7 @@
         <w:pStyle w:val="ImageCaption"/>
       </w:pPr>
       <w:r>
-        <w:t xml:space="preserve">Verification (thermal): transient temperature profiles from the present DQM+Newmark solver against the exact Bessel-series solution at t = 2, 10 and 40 s.</w:t>
+        <w:t xml:space="preserve">Figure 4-5: Verification (thermal) — transient temperature profiles of the present DQM+Newmark solver against the exact Bessel-series solution at t = 2, 10 and 40 s</w:t>
       </w:r>
     </w:p>
     <w:p>
@@ -2725,7 +2725,7 @@
           <w:b/>
           <w:bCs/>
         </w:rPr>
-        <w:t xml:space="preserve">Figure 4-6.</w:t>
+        <w:t xml:space="preserve">4-6</w:t>
       </w:r>
     </w:p>
     <w:p>
@@ -2737,7 +2737,7 @@
           <wp:inline>
             <wp:extent cx="5334000" cy="3472656"/>
             <wp:effectExtent b="0" l="0" r="0" t="0"/>
-            <wp:docPr descr="Verification (Lord-Shulman waves): second-sound temperature fronts through the wall against Bagri &amp; Eslami (2007), Fig. 2." title="" id="32" name="Picture"/>
+            <wp:docPr descr="Figure 4-6: Verification (Lord–Shulman waves) — second-sound temperature fronts through the wall against Bagri &amp; Eslami (2007), Fig. 2" title="" id="32" name="Picture"/>
             <a:graphic>
               <a:graphicData uri="http://schemas.openxmlformats.org/drawingml/2006/picture">
                 <pic:pic>
@@ -2780,7 +2780,7 @@
         <w:pStyle w:val="ImageCaption"/>
       </w:pPr>
       <w:r>
-        <w:t xml:space="preserve">Verification (Lord-Shulman waves): second-sound temperature fronts through the wall against Bagri &amp; Eslami (2007), Fig. 2.</w:t>
+        <w:t xml:space="preserve">Figure 4-6: Verification (Lord–Shulman waves) — second-sound temperature fronts through the wall against Bagri &amp; Eslami (2007), Fig. 2</w:t>
       </w:r>
     </w:p>
     <w:p>
@@ -3145,7 +3145,7 @@
           <w:b/>
           <w:bCs/>
         </w:rPr>
-        <w:t xml:space="preserve">Figure 4-7.</w:t>
+        <w:t xml:space="preserve">4-7</w:t>
       </w:r>
     </w:p>
     <w:p>
@@ -3157,7 +3157,7 @@
           <wp:inline>
             <wp:extent cx="5334000" cy="3708431"/>
             <wp:effectExtent b="0" l="0" r="0" t="0"/>
-            <wp:docPr descr="Effect of the GPL distribution pattern (UD, O, X, V, A): mid-point T* and U* histories vs Fo and the final T*, hoop-stress profiles vs xi." title="" id="36" name="Picture"/>
+            <wp:docPr descr="Figure 4-7: Effect of the GPL distribution pattern (UD, O, X, V, A) on the mid-point T* and U* histories and the final T* and Σθθ profiles [R_i=1, R_o=1.5, L=2.1 m, N_L=7, W_GPL=0.3%, e_m3=0.8604, τ*=0.15, P_i=50 MPa, simply supported]" title="" id="36" name="Picture"/>
             <a:graphic>
               <a:graphicData uri="http://schemas.openxmlformats.org/drawingml/2006/picture">
                 <pic:pic>
@@ -3200,7 +3200,7 @@
         <w:pStyle w:val="ImageCaption"/>
       </w:pPr>
       <w:r>
-        <w:t xml:space="preserve">Effect of the GPL distribution pattern (UD, O, X, V, A): mid-point T* and U* histories vs Fo and the final T*, hoop-stress profiles vs xi.</w:t>
+        <w:t xml:space="preserve">Figure 4-7: Effect of the GPL distribution pattern (UD, O, X, V, A) on the mid-point T* and U* histories and the final T* and Σθθ profiles [R_i=1, R_o=1.5, L=2.1 m, N_L=7, W_GPL=0.3%, e_m3=0.8604, τ*=0.15, P_i=50 MPa, simply supported]</w:t>
       </w:r>
     </w:p>
     <w:p>
@@ -3502,7 +3502,7 @@
           <w:b/>
           <w:bCs/>
         </w:rPr>
-        <w:t xml:space="preserve">Figure 4-8.</w:t>
+        <w:t xml:space="preserve">4-8</w:t>
       </w:r>
     </w:p>
     <w:p>
@@ -3514,7 +3514,7 @@
           <wp:inline>
             <wp:extent cx="5334000" cy="3708431"/>
             <wp:effectExtent b="0" l="0" r="0" t="0"/>
-            <wp:docPr descr="Effect of the porosity distribution pattern (UD, O, X, V, A), GPL kept uniform; pattern A acts as a thermal barrier." title="" id="40" name="Picture"/>
+            <wp:docPr descr="Figure 4-8: Effect of the porosity distribution pattern (UD, O, X, V, A), GPL uniform [R_i=1, R_o=1.5, L=2.1 m, N_L=7, W_GPL=0.3%, e_m3=0.8604, τ*=0.15, P_i=50 MPa, simply supported]" title="" id="40" name="Picture"/>
             <a:graphic>
               <a:graphicData uri="http://schemas.openxmlformats.org/drawingml/2006/picture">
                 <pic:pic>
@@ -3557,7 +3557,7 @@
         <w:pStyle w:val="ImageCaption"/>
       </w:pPr>
       <w:r>
-        <w:t xml:space="preserve">Effect of the porosity distribution pattern (UD, O, X, V, A), GPL kept uniform; pattern A acts as a thermal barrier.</w:t>
+        <w:t xml:space="preserve">Figure 4-8: Effect of the porosity distribution pattern (UD, O, X, V, A), GPL uniform [R_i=1, R_o=1.5, L=2.1 m, N_L=7, W_GPL=0.3%, e_m3=0.8604, τ*=0.15, P_i=50 MPa, simply supported]</w:t>
       </w:r>
     </w:p>
     <w:p>
@@ -3694,7 +3694,7 @@
           <w:b/>
           <w:bCs/>
         </w:rPr>
-        <w:t xml:space="preserve">Figure 4-9.</w:t>
+        <w:t xml:space="preserve">4-9</w:t>
       </w:r>
     </w:p>
     <w:p>
@@ -3706,7 +3706,7 @@
           <wp:inline>
             <wp:extent cx="5334000" cy="3708431"/>
             <wp:effectExtent b="0" l="0" r="0" t="0"/>
-            <wp:docPr descr="Effect of the porosity level e_m3 = 0.9675 / 0.8604 / 0.7776 (light / moderate / heavy)." title="" id="43" name="Picture"/>
+            <wp:docPr descr="Figure 4-9: Effect of the porosity level e_m3 = 0.9675 / 0.8604 / 0.7776 [R_o/R_i=1.5, L=2.1 m, N_L=7, W_GPL=0.3%, UD, τ*=0.15, P_i=50 MPa, simply supported]" title="" id="43" name="Picture"/>
             <a:graphic>
               <a:graphicData uri="http://schemas.openxmlformats.org/drawingml/2006/picture">
                 <pic:pic>
@@ -3749,7 +3749,7 @@
         <w:pStyle w:val="ImageCaption"/>
       </w:pPr>
       <w:r>
-        <w:t xml:space="preserve">Effect of the porosity level e_m3 = 0.9675 / 0.8604 / 0.7776 (light / moderate / heavy).</w:t>
+        <w:t xml:space="preserve">Figure 4-9: Effect of the porosity level e_m3 = 0.9675 / 0.8604 / 0.7776 [R_o/R_i=1.5, L=2.1 m, N_L=7, W_GPL=0.3%, UD, τ*=0.15, P_i=50 MPa, simply supported]</w:t>
       </w:r>
     </w:p>
     <w:p>
@@ -3815,7 +3815,7 @@
           <w:b/>
           <w:bCs/>
         </w:rPr>
-        <w:t xml:space="preserve">Figure 4-10.</w:t>
+        <w:t xml:space="preserve">4-10</w:t>
       </w:r>
     </w:p>
     <w:p>
@@ -3827,7 +3827,7 @@
           <wp:inline>
             <wp:extent cx="5334000" cy="3708431"/>
             <wp:effectExtent b="0" l="0" r="0" t="0"/>
-            <wp:docPr descr="Effect of the GPL weight fraction, low range W = 0.1 / 0.3 / 0.5 / 0.9 / 1.5 %." title="" id="47" name="Picture"/>
+            <wp:docPr descr="Figure 4-10: Effect of the GPL weight fraction (low range) W = 0.1 / 0.3 / 0.5 / 0.9 / 1.5 % [R_o/R_i=1.5, L=2.1 m, N_L=7, UD, e_m3=0.8604, τ*=0.15, P_i=50 MPa, simply supported]" title="" id="47" name="Picture"/>
             <a:graphic>
               <a:graphicData uri="http://schemas.openxmlformats.org/drawingml/2006/picture">
                 <pic:pic>
@@ -3870,7 +3870,7 @@
         <w:pStyle w:val="ImageCaption"/>
       </w:pPr>
       <w:r>
-        <w:t xml:space="preserve">Effect of the GPL weight fraction, low range W = 0.1 / 0.3 / 0.5 / 0.9 / 1.5 %.</w:t>
+        <w:t xml:space="preserve">Figure 4-10: Effect of the GPL weight fraction (low range) W = 0.1 / 0.3 / 0.5 / 0.9 / 1.5 % [R_o/R_i=1.5, L=2.1 m, N_L=7, UD, e_m3=0.8604, τ*=0.15, P_i=50 MPa, simply supported]</w:t>
       </w:r>
     </w:p>
     <w:p>
@@ -3950,7 +3950,7 @@
           <w:b/>
           <w:bCs/>
         </w:rPr>
-        <w:t xml:space="preserve">Figure 4-11.</w:t>
+        <w:t xml:space="preserve">4-11</w:t>
       </w:r>
     </w:p>
     <w:p>
@@ -3962,7 +3962,7 @@
           <wp:inline>
             <wp:extent cx="5334000" cy="3708431"/>
             <wp:effectExtent b="0" l="0" r="0" t="0"/>
-            <wp:docPr descr="Effect of the GPL weight fraction, high range W = 1 / 2 / 4 / 8 %; the thermal gain saturates while the stresses grow." title="" id="50" name="Picture"/>
+            <wp:docPr descr="Figure 4-11: Effect of the GPL weight fraction (high range) W = 1 / 2 / 4 / 8 % [R_o/R_i=1.5, L=2.1 m, N_L=7, UD, e_m3=0.8604, τ*=0.15, P_i=50 MPa, simply supported]" title="" id="50" name="Picture"/>
             <a:graphic>
               <a:graphicData uri="http://schemas.openxmlformats.org/drawingml/2006/picture">
                 <pic:pic>
@@ -4005,7 +4005,7 @@
         <w:pStyle w:val="ImageCaption"/>
       </w:pPr>
       <w:r>
-        <w:t xml:space="preserve">Effect of the GPL weight fraction, high range W = 1 / 2 / 4 / 8 %; the thermal gain saturates while the stresses grow.</w:t>
+        <w:t xml:space="preserve">Figure 4-11: Effect of the GPL weight fraction (high range) W = 1 / 2 / 4 / 8 % [R_o/R_i=1.5, L=2.1 m, N_L=7, UD, e_m3=0.8604, τ*=0.15, P_i=50 MPa, simply supported]</w:t>
       </w:r>
     </w:p>
     <w:p>
@@ -4133,7 +4133,7 @@
           <w:b/>
           <w:bCs/>
         </w:rPr>
-        <w:t xml:space="preserve">Figure 4-12.</w:t>
+        <w:t xml:space="preserve">4-12</w:t>
       </w:r>
     </w:p>
     <w:p>
@@ -4143,9 +4143,9 @@
       <w:r>
         <w:drawing>
           <wp:inline>
-            <wp:extent cx="5334000" cy="3708431"/>
+            <wp:extent cx="5334000" cy="3297867"/>
             <wp:effectExtent b="0" l="0" r="0" t="0"/>
-            <wp:docPr descr="Effect of the platelet length-to-width aspect ratio a/b = 1.0 / 1.67 / 2.67." title="" id="54" name="Picture"/>
+            <wp:docPr descr="Figure 4-12: Effect of the platelet length-to-width aspect ratio a/b = 1.0 / 1.67 / 2.67 [R_o/R_i=1.5, L=2.1 m, N_L=7, W_GPL=0.3%, e_m3=0.8604, τ*=0.15, P_i=50 MPa, simply supported]" title="" id="54" name="Picture"/>
             <a:graphic>
               <a:graphicData uri="http://schemas.openxmlformats.org/drawingml/2006/picture">
                 <pic:pic>
@@ -4164,7 +4164,7 @@
                   <pic:spPr bwMode="auto">
                     <a:xfrm>
                       <a:off x="0" y="0"/>
-                      <a:ext cx="5334000" cy="3708431"/>
+                      <a:ext cx="5334000" cy="3297867"/>
                     </a:xfrm>
                     <a:prstGeom prst="rect">
                       <a:avLst/>
@@ -4188,7 +4188,7 @@
         <w:pStyle w:val="ImageCaption"/>
       </w:pPr>
       <w:r>
-        <w:t xml:space="preserve">Effect of the platelet length-to-width aspect ratio a/b = 1.0 / 1.67 / 2.67.</w:t>
+        <w:t xml:space="preserve">Figure 4-12: Effect of the platelet length-to-width aspect ratio a/b = 1.0 / 1.67 / 2.67 [R_o/R_i=1.5, L=2.1 m, N_L=7, W_GPL=0.3%, e_m3=0.8604, τ*=0.15, P_i=50 MPa, simply supported]</w:t>
       </w:r>
     </w:p>
     <w:p>
@@ -4226,7 +4226,7 @@
           <w:b/>
           <w:bCs/>
         </w:rPr>
-        <w:t xml:space="preserve">Figure 4-13.</w:t>
+        <w:t xml:space="preserve">4-13</w:t>
       </w:r>
     </w:p>
     <w:p>
@@ -4238,7 +4238,7 @@
           <wp:inline>
             <wp:extent cx="5334000" cy="3708431"/>
             <wp:effectExtent b="0" l="0" r="0" t="0"/>
-            <wp:docPr descr="Effect of the platelet width-to-thickness aspect ratio b/t = 500 / 1000 / 2000." title="" id="57" name="Picture"/>
+            <wp:docPr descr="Figure 4-13: Effect of the platelet width-to-thickness aspect ratio b/t = 500 / 1000 / 2000 [R_o/R_i=1.5, L=2.1 m, N_L=7, W_GPL=0.3%, e_m3=0.8604, τ*=0.15, P_i=50 MPa, simply supported]" title="" id="57" name="Picture"/>
             <a:graphic>
               <a:graphicData uri="http://schemas.openxmlformats.org/drawingml/2006/picture">
                 <pic:pic>
@@ -4281,7 +4281,7 @@
         <w:pStyle w:val="ImageCaption"/>
       </w:pPr>
       <w:r>
-        <w:t xml:space="preserve">Effect of the platelet width-to-thickness aspect ratio b/t = 500 / 1000 / 2000.</w:t>
+        <w:t xml:space="preserve">Figure 4-13: Effect of the platelet width-to-thickness aspect ratio b/t = 500 / 1000 / 2000 [R_o/R_i=1.5, L=2.1 m, N_L=7, W_GPL=0.3%, e_m3=0.8604, τ*=0.15, P_i=50 MPa, simply supported]</w:t>
       </w:r>
     </w:p>
     <w:p>
@@ -4365,7 +4365,7 @@
           <w:b/>
           <w:bCs/>
         </w:rPr>
-        <w:t xml:space="preserve">Figure 4-14.</w:t>
+        <w:t xml:space="preserve">4-14</w:t>
       </w:r>
     </w:p>
     <w:p>
@@ -4375,9 +4375,9 @@
       <w:r>
         <w:drawing>
           <wp:inline>
-            <wp:extent cx="5334000" cy="3708431"/>
+            <wp:extent cx="5334000" cy="3297867"/>
             <wp:effectExtent b="0" l="0" r="0" t="0"/>
-            <wp:docPr descr="Effect of the relaxation time: Fourier (tau=0) and Lord-Shulman tau = 0.04 / 0.15 / 0.44 / 0.87; overshoot grows with tau*." title="" id="61" name="Picture"/>
+            <wp:docPr descr="Figure 4-14: Effect of the relaxation time — Fourier (τ=0) and Lord–Shulman τ = 0.04 / 0.15 / 0.44 [R_o/R_i=1.5, L=2.1 m, N_L=7, W_GPL=0.3%, e_m3=0.8604, P_i=50 MPa, simply supported]" title="" id="61" name="Picture"/>
             <a:graphic>
               <a:graphicData uri="http://schemas.openxmlformats.org/drawingml/2006/picture">
                 <pic:pic>
@@ -4396,7 +4396,7 @@
                   <pic:spPr bwMode="auto">
                     <a:xfrm>
                       <a:off x="0" y="0"/>
-                      <a:ext cx="5334000" cy="3708431"/>
+                      <a:ext cx="5334000" cy="3297867"/>
                     </a:xfrm>
                     <a:prstGeom prst="rect">
                       <a:avLst/>
@@ -4420,20 +4420,20 @@
         <w:pStyle w:val="ImageCaption"/>
       </w:pPr>
       <w:r>
-        <w:t xml:space="preserve">Effect of the relaxation time: Fourier (tau</w:t>
+        <w:t xml:space="preserve">Figure 4-14: Effect of the relaxation time — Fourier (τ</w:t>
       </w:r>
       <w:r>
         <w:rPr>
           <w:i/>
           <w:iCs/>
         </w:rPr>
-        <w:t xml:space="preserve">=0) and Lord-Shulman tau</w:t>
-      </w:r>
-      <w:r>
-        <w:t xml:space="preserve"> </w:t>
-      </w:r>
-      <w:r>
-        <w:t xml:space="preserve">= 0.04 / 0.15 / 0.44 / 0.87; overshoot grows with tau*.</w:t>
+        <w:t xml:space="preserve">=0) and Lord–Shulman τ</w:t>
+      </w:r>
+      <w:r>
+        <w:t xml:space="preserve"> </w:t>
+      </w:r>
+      <w:r>
+        <w:t xml:space="preserve">= 0.04 / 0.15 / 0.44 [R_o/R_i=1.5, L=2.1 m, N_L=7, W_GPL=0.3%, e_m3=0.8604, P_i=50 MPa, simply supported]</w:t>
       </w:r>
     </w:p>
     <w:p>
@@ -4447,7 +4447,7 @@
         <w:t xml:space="preserve"> </w:t>
       </w:r>
       <w:r>
-        <w:t xml:space="preserve">relaxation times τ* = 0.04, 0.15, 0.44 and 0.87. Under Fourier conduction the</w:t>
+        <w:t xml:space="preserve">relaxation times τ* = 0.04, 0.15 and 0.44. Under Fourier conduction the</w:t>
       </w:r>
       <w:r>
         <w:t xml:space="preserve"> </w:t>
@@ -4477,7 +4477,7 @@
         <w:t xml:space="preserve"> </w:t>
       </w:r>
       <w:r>
-        <w:t xml:space="preserve">0.953, 0.962, 1.166 and 1.271 as τ* increases, and for the two larger values the</w:t>
+        <w:t xml:space="preserve">0.953, 0.962 and 1.166 as τ* increases, and at the largest value the</w:t>
       </w:r>
       <w:r>
         <w:t xml:space="preserve"> </w:t>
@@ -4499,13 +4499,13 @@
         <w:t xml:space="preserve"> </w:t>
       </w:r>
       <w:r>
-        <w:t xml:space="preserve">even the inner-surface value — reaching 1.271 at</w:t>
-      </w:r>
-      <w:r>
-        <w:t xml:space="preserve"> </w:t>
-      </w:r>
-      <w:r>
-        <w:t xml:space="preserve">τ* = 0.87 — a purely hyperbolic phenomenon impossible in the parabolic Fourier</w:t>
+        <w:t xml:space="preserve">even the inner-surface value — reaching 1.166 at</w:t>
+      </w:r>
+      <w:r>
+        <w:t xml:space="preserve"> </w:t>
+      </w:r>
+      <w:r>
+        <w:t xml:space="preserve">τ* = 0.44 — a purely hyperbolic phenomenon impossible in the parabolic Fourier</w:t>
       </w:r>
       <w:r>
         <w:t xml:space="preserve"> </w:t>
@@ -4563,7 +4563,7 @@
           <w:b/>
           <w:bCs/>
         </w:rPr>
-        <w:t xml:space="preserve">Figure 4-15.</w:t>
+        <w:t xml:space="preserve">4-15</w:t>
       </w:r>
     </w:p>
     <w:p>
@@ -4575,7 +4575,7 @@
           <wp:inline>
             <wp:extent cx="5334000" cy="3708431"/>
             <wp:effectExtent b="0" l="0" r="0" t="0"/>
-            <wp:docPr descr="Effect of the end supports: simply supported (S-S), mixed (S-C) and clamped (C-C)." title="" id="65" name="Picture"/>
+            <wp:docPr descr="Figure 4-15: Effect of the end supports — simply supported (S-S), mixed (S-C) and clamped (C-C) [R_o/R_i=1.5, L=2.1 m, N_L=7, W_GPL=0.3%, e_m3=0.8604, τ*=0.15, P_i=50 MPa]" title="" id="65" name="Picture"/>
             <a:graphic>
               <a:graphicData uri="http://schemas.openxmlformats.org/drawingml/2006/picture">
                 <pic:pic>
@@ -4618,7 +4618,7 @@
         <w:pStyle w:val="ImageCaption"/>
       </w:pPr>
       <w:r>
-        <w:t xml:space="preserve">Effect of the end supports: simply supported (S-S), mixed (S-C) and clamped (C-C).</w:t>
+        <w:t xml:space="preserve">Figure 4-15: Effect of the end supports — simply supported (S-S), mixed (S-C) and clamped (C-C) [R_o/R_i=1.5, L=2.1 m, N_L=7, W_GPL=0.3%, e_m3=0.8604, τ*=0.15, P_i=50 MPa]</w:t>
       </w:r>
     </w:p>
     <w:p>
@@ -4778,7 +4778,7 @@
           <w:b/>
           <w:bCs/>
         </w:rPr>
-        <w:t xml:space="preserve">Figure 4-16.</w:t>
+        <w:t xml:space="preserve">4-16</w:t>
       </w:r>
     </w:p>
     <w:p>
@@ -4790,7 +4790,7 @@
           <wp:inline>
             <wp:extent cx="5334000" cy="3297867"/>
             <wp:effectExtent b="0" l="0" r="0" t="0"/>
-            <wp:docPr descr="Effect of the internal pressure P_i = 0 / 10 / 50 / 100 MPa; the mechanical response grows linearly." title="" id="69" name="Picture"/>
+            <wp:docPr descr="Figure 4-16: Effect of the internal pressure P_i = 0 / 10 / 50 / 100 MPa [R_o/R_i=1.5, L=2.1 m, N_L=7, W_GPL=0.3%, e_m3=0.8604, τ*=0.15, simply supported]" title="" id="69" name="Picture"/>
             <a:graphic>
               <a:graphicData uri="http://schemas.openxmlformats.org/drawingml/2006/picture">
                 <pic:pic>
@@ -4833,7 +4833,7 @@
         <w:pStyle w:val="ImageCaption"/>
       </w:pPr>
       <w:r>
-        <w:t xml:space="preserve">Effect of the internal pressure P_i = 0 / 10 / 50 / 100 MPa; the mechanical response grows linearly.</w:t>
+        <w:t xml:space="preserve">Figure 4-16: Effect of the internal pressure P_i = 0 / 10 / 50 / 100 MPa [R_o/R_i=1.5, L=2.1 m, N_L=7, W_GPL=0.3%, e_m3=0.8604, τ*=0.15, simply supported]</w:t>
       </w:r>
     </w:p>
     <w:p>
@@ -4947,7 +4947,7 @@
           <w:b/>
           <w:bCs/>
         </w:rPr>
-        <w:t xml:space="preserve">Figure 4-17.</w:t>
+        <w:t xml:space="preserve">4-17</w:t>
       </w:r>
     </w:p>
     <w:p>
@@ -4957,9 +4957,9 @@
       <w:r>
         <w:drawing>
           <wp:inline>
-            <wp:extent cx="5334000" cy="3164350"/>
+            <wp:extent cx="5334000" cy="3708431"/>
             <wp:effectExtent b="0" l="0" r="0" t="0"/>
-            <wp:docPr descr="Effect of the cylinder length L = 1 / 2.1 / 5 / 10 m and the approach to the long-cylinder limit." title="" id="73" name="Picture"/>
+            <wp:docPr descr="Figure 4-17: Effect of the cylinder length L = 1 / 2.1 / 5 / 10 m [R_i=1, R_o=1.5, N_L=7, W_GPL=0.3%, e_m3=0.8604, τ*=0.15, P_i=50 MPa, simply supported]" title="" id="73" name="Picture"/>
             <a:graphic>
               <a:graphicData uri="http://schemas.openxmlformats.org/drawingml/2006/picture">
                 <pic:pic>
@@ -4978,7 +4978,7 @@
                   <pic:spPr bwMode="auto">
                     <a:xfrm>
                       <a:off x="0" y="0"/>
-                      <a:ext cx="5334000" cy="3164350"/>
+                      <a:ext cx="5334000" cy="3708431"/>
                     </a:xfrm>
                     <a:prstGeom prst="rect">
                       <a:avLst/>
@@ -5002,7 +5002,7 @@
         <w:pStyle w:val="ImageCaption"/>
       </w:pPr>
       <w:r>
-        <w:t xml:space="preserve">Effect of the cylinder length L = 1 / 2.1 / 5 / 10 m and the approach to the long-cylinder limit.</w:t>
+        <w:t xml:space="preserve">Figure 4-17: Effect of the cylinder length L = 1 / 2.1 / 5 / 10 m [R_i=1, R_o=1.5, N_L=7, W_GPL=0.3%, e_m3=0.8604, τ*=0.15, P_i=50 MPa, simply supported]</w:t>
       </w:r>
     </w:p>
     <w:p>
@@ -5136,7 +5136,7 @@
           <w:b/>
           <w:bCs/>
         </w:rPr>
-        <w:t xml:space="preserve">Figure 4-18.</w:t>
+        <w:t xml:space="preserve">4-18</w:t>
       </w:r>
     </w:p>
     <w:p>
@@ -5146,9 +5146,9 @@
       <w:r>
         <w:drawing>
           <wp:inline>
-            <wp:extent cx="5334000" cy="3982720"/>
+            <wp:extent cx="5334000" cy="2695073"/>
             <wp:effectExtent b="0" l="0" r="0" t="0"/>
-            <wp:docPr descr="Full 25-case GPL x porosity matrix: through-wall dimensionless temperature T*(xi) for every pattern pair; porosity A is a universal thermal barrier." title="" id="77" name="Picture"/>
+            <wp:docPr descr="Figure 4-18: Full 25-case GPL × porosity matrix — through-wall dimensionless temperature T*(ξ) for every pattern pair (rows: GPL pattern; columns: porosity pattern) [reference: W_GPL=0.3%, e_m3=0.8604, τ*=0.15, P_i=50 MPa, simply supported]" title="" id="77" name="Picture"/>
             <a:graphic>
               <a:graphicData uri="http://schemas.openxmlformats.org/drawingml/2006/picture">
                 <pic:pic>
@@ -5167,7 +5167,7 @@
                   <pic:spPr bwMode="auto">
                     <a:xfrm>
                       <a:off x="0" y="0"/>
-                      <a:ext cx="5334000" cy="3982720"/>
+                      <a:ext cx="5334000" cy="2695073"/>
                     </a:xfrm>
                     <a:prstGeom prst="rect">
                       <a:avLst/>
@@ -5191,7 +5191,7 @@
         <w:pStyle w:val="ImageCaption"/>
       </w:pPr>
       <w:r>
-        <w:t xml:space="preserve">Full 25-case GPL x porosity matrix: through-wall dimensionless temperature T*(xi) for every pattern pair; porosity A is a universal thermal barrier.</w:t>
+        <w:t xml:space="preserve">Figure 4-18: Full 25-case GPL × porosity matrix — through-wall dimensionless temperature T*(ξ) for every pattern pair (rows: GPL pattern; columns: porosity pattern) [reference: W_GPL=0.3%, e_m3=0.8604, τ*=0.15, P_i=50 MPa, simply supported]</w:t>
       </w:r>
     </w:p>
     <w:p>
@@ -5280,7 +5280,7 @@
           <w:b/>
           <w:bCs/>
         </w:rPr>
-        <w:t xml:space="preserve">Figure 4-19.</w:t>
+        <w:t xml:space="preserve">4-19</w:t>
       </w:r>
     </w:p>
     <w:p>
@@ -5290,9 +5290,9 @@
       <w:r>
         <w:drawing>
           <wp:inline>
-            <wp:extent cx="5334000" cy="3982720"/>
+            <wp:extent cx="5334000" cy="2695073"/>
             <wp:effectExtent b="0" l="0" r="0" t="0"/>
-            <wp:docPr descr="Full 25-case GPL x porosity matrix: hoop-stress profile Sigma_thth(xi) for every pattern pair." title="" id="80" name="Picture"/>
+            <wp:docPr descr="Figure 4-19: Full 25-case GPL × porosity matrix — hoop-stress profile Σθθ(ξ) for every pattern pair (rows: GPL pattern; columns: porosity pattern) [reference: W_GPL=0.3%, e_m3=0.8604, τ*=0.15, P_i=50 MPa, simply supported]" title="" id="80" name="Picture"/>
             <a:graphic>
               <a:graphicData uri="http://schemas.openxmlformats.org/drawingml/2006/picture">
                 <pic:pic>
@@ -5311,7 +5311,7 @@
                   <pic:spPr bwMode="auto">
                     <a:xfrm>
                       <a:off x="0" y="0"/>
-                      <a:ext cx="5334000" cy="3982720"/>
+                      <a:ext cx="5334000" cy="2695073"/>
                     </a:xfrm>
                     <a:prstGeom prst="rect">
                       <a:avLst/>
@@ -5335,7 +5335,7 @@
         <w:pStyle w:val="ImageCaption"/>
       </w:pPr>
       <w:r>
-        <w:t xml:space="preserve">Full 25-case GPL x porosity matrix: hoop-stress profile Sigma_thth(xi) for every pattern pair.</w:t>
+        <w:t xml:space="preserve">Figure 4-19: Full 25-case GPL × porosity matrix — hoop-stress profile Σθθ(ξ) for every pattern pair (rows: GPL pattern; columns: porosity pattern) [reference: W_GPL=0.3%, e_m3=0.8604, τ*=0.15, P_i=50 MPa, simply supported]</w:t>
       </w:r>
     </w:p>
     <w:p>
@@ -5455,7 +5455,7 @@
           <w:b/>
           <w:bCs/>
         </w:rPr>
-        <w:t xml:space="preserve">Figure 4-20.</w:t>
+        <w:t xml:space="preserve">4-20</w:t>
       </w:r>
     </w:p>
     <w:p>
@@ -5467,7 +5467,7 @@
           <wp:inline>
             <wp:extent cx="5334000" cy="3708431"/>
             <wp:effectExtent b="0" l="0" r="0" t="0"/>
-            <wp:docPr descr="Effect of thermo-mechanical coupling: fully coupled versus uncoupled energy equation." title="" id="84" name="Picture"/>
+            <wp:docPr descr="Figure 4-20: Effect of thermo-mechanical coupling — fully coupled versus uncoupled energy equation [R_o/R_i=1.5, L=2.1 m, N_L=7, W_GPL=0.3%, e_m3=0.8604, τ*=0.15, P_i=50 MPa, simply supported]" title="" id="84" name="Picture"/>
             <a:graphic>
               <a:graphicData uri="http://schemas.openxmlformats.org/drawingml/2006/picture">
                 <pic:pic>
@@ -5510,7 +5510,7 @@
         <w:pStyle w:val="ImageCaption"/>
       </w:pPr>
       <w:r>
-        <w:t xml:space="preserve">Effect of thermo-mechanical coupling: fully coupled versus uncoupled energy equation.</w:t>
+        <w:t xml:space="preserve">Figure 4-20: Effect of thermo-mechanical coupling — fully coupled versus uncoupled energy equation [R_o/R_i=1.5, L=2.1 m, N_L=7, W_GPL=0.3%, e_m3=0.8604, τ*=0.15, P_i=50 MPa, simply supported]</w:t>
       </w:r>
     </w:p>
     <w:p>
@@ -5594,7 +5594,7 @@
           <w:b/>
           <w:bCs/>
         </w:rPr>
-        <w:t xml:space="preserve">Figure 4-21.</w:t>
+        <w:t xml:space="preserve">4-21</w:t>
       </w:r>
     </w:p>
     <w:p>
@@ -5606,7 +5606,7 @@
           <wp:inline>
             <wp:extent cx="5334000" cy="3708431"/>
             <wp:effectExtent b="0" l="0" r="0" t="0"/>
-            <wp:docPr descr="Effect of the outer-surface convection coefficient h_c = 10 / 100 / 1000 W/m2K." title="" id="88" name="Picture"/>
+            <wp:docPr descr="Figure 4-21: Effect of the outer-surface convection coefficient h_c = 10 / 100 / 1000 W/m²K [R_o/R_i=1.5, L=2.1 m, N_L=7, W_GPL=0.3%, e_m3=0.8604, τ*=0.15, P_i=50 MPa, simply supported]" title="" id="88" name="Picture"/>
             <a:graphic>
               <a:graphicData uri="http://schemas.openxmlformats.org/drawingml/2006/picture">
                 <pic:pic>
@@ -5649,7 +5649,7 @@
         <w:pStyle w:val="ImageCaption"/>
       </w:pPr>
       <w:r>
-        <w:t xml:space="preserve">Effect of the outer-surface convection coefficient h_c = 10 / 100 / 1000 W/m2K.</w:t>
+        <w:t xml:space="preserve">Figure 4-21: Effect of the outer-surface convection coefficient h_c = 10 / 100 / 1000 W/m²K [R_o/R_i=1.5, L=2.1 m, N_L=7, W_GPL=0.3%, e_m3=0.8604, τ*=0.15, P_i=50 MPa, simply supported]</w:t>
       </w:r>
     </w:p>
     <w:p>
@@ -5733,7 +5733,7 @@
           <w:b/>
           <w:bCs/>
         </w:rPr>
-        <w:t xml:space="preserve">Figure 4-22.</w:t>
+        <w:t xml:space="preserve">4-22</w:t>
       </w:r>
     </w:p>
     <w:p>
@@ -5743,9 +5743,9 @@
       <w:r>
         <w:drawing>
           <wp:inline>
-            <wp:extent cx="5334000" cy="3708431"/>
+            <wp:extent cx="5334000" cy="3297867"/>
             <wp:effectExtent b="0" l="0" r="0" t="0"/>
-            <wp:docPr descr="Effect of the wall thickness, radius ratio R_o/R_i = 1.25 / 1.5 / 2.0 (inner radius fixed)." title="" id="92" name="Picture"/>
+            <wp:docPr descr="Figure 4-22: Effect of the wall thickness, radius ratio R_o/R_i = 1.25 / 1.5 / 2.0 (inner radius fixed at 1 m) [L=2.1 m, N_L=7, W_GPL=0.3%, e_m3=0.8604, τ*=0.15, P_i=50 MPa, simply supported]" title="" id="92" name="Picture"/>
             <a:graphic>
               <a:graphicData uri="http://schemas.openxmlformats.org/drawingml/2006/picture">
                 <pic:pic>
@@ -5757,6 +5757,163 @@
                   </pic:nvPicPr>
                   <pic:blipFill>
                     <a:blip r:embed="rId91"/>
+                    <a:stretch>
+                      <a:fillRect/>
+                    </a:stretch>
+                  </pic:blipFill>
+                  <pic:spPr bwMode="auto">
+                    <a:xfrm>
+                      <a:off x="0" y="0"/>
+                      <a:ext cx="5334000" cy="3297867"/>
+                    </a:xfrm>
+                    <a:prstGeom prst="rect">
+                      <a:avLst/>
+                    </a:prstGeom>
+                    <a:noFill/>
+                    <a:ln w="9525">
+                      <a:noFill/>
+                      <a:headEnd/>
+                      <a:tailEnd/>
+                    </a:ln>
+                  </pic:spPr>
+                </pic:pic>
+              </a:graphicData>
+            </a:graphic>
+          </wp:inline>
+        </w:drawing>
+      </w:r>
+    </w:p>
+    <w:p>
+      <w:pPr>
+        <w:pStyle w:val="ImageCaption"/>
+      </w:pPr>
+      <w:r>
+        <w:t xml:space="preserve">Figure 4-22: Effect of the wall thickness, radius ratio R_o/R_i = 1.25 / 1.5 / 2.0 (inner radius fixed at 1 m) [L=2.1 m, N_L=7, W_GPL=0.3%, e_m3=0.8604, τ*=0.15, P_i=50 MPa, simply supported]</w:t>
+      </w:r>
+    </w:p>
+    <w:p>
+      <w:pPr>
+        <w:pStyle w:val="BodyText"/>
+      </w:pPr>
+      <w:r>
+        <w:t xml:space="preserve">Figure 4-22 compares three cylinders with radius ratios R_o/R_i = 1.25, 1.5 and</w:t>
+      </w:r>
+      <w:r>
+        <w:t xml:space="preserve"> </w:t>
+      </w:r>
+      <w:r>
+        <w:t xml:space="preserve">2.0 (inner radius fixed at 1 m; wall thickness 0.25, 0.5 and 1.0 m); the time</w:t>
+      </w:r>
+      <w:r>
+        <w:t xml:space="preserve"> </w:t>
+      </w:r>
+      <w:r>
+        <w:t xml:space="preserve">scale of each is nondimensionalized with its own wall thickness. The thin wall</w:t>
+      </w:r>
+      <w:r>
+        <w:t xml:space="preserve"> </w:t>
+      </w:r>
+      <w:r>
+        <w:t xml:space="preserve">(ratio 1.25) is crossed quickly by the thermal wave, so its outer surface heats</w:t>
+      </w:r>
+      <w:r>
+        <w:t xml:space="preserve"> </w:t>
+      </w:r>
+      <w:r>
+        <w:t xml:space="preserve">fully (outer temperature 0.999), but the small thickness concentrates the thermal</w:t>
+      </w:r>
+      <w:r>
+        <w:t xml:space="preserve"> </w:t>
+      </w:r>
+      <w:r>
+        <w:t xml:space="preserve">strain and produces the largest mechanical response of the study — an</w:t>
+      </w:r>
+      <w:r>
+        <w:t xml:space="preserve"> </w:t>
+      </w:r>
+      <w:r>
+        <w:t xml:space="preserve">inner-surface hoop stress of 4.017 and a peak displacement of 26.6. The thick wall</w:t>
+      </w:r>
+      <w:r>
+        <w:t xml:space="preserve"> </w:t>
+      </w:r>
+      <w:r>
+        <w:t xml:space="preserve">(ratio 2.0) behaves oppositely: within the window the wave does not fully cross,</w:t>
+      </w:r>
+      <w:r>
+        <w:t xml:space="preserve"> </w:t>
+      </w:r>
+      <w:r>
+        <w:t xml:space="preserve">the outer region stays cooler (outer temperature 0.740), the displacement collapses</w:t>
+      </w:r>
+      <w:r>
+        <w:t xml:space="preserve"> </w:t>
+      </w:r>
+      <w:r>
+        <w:t xml:space="preserve">to 2.66, and the inner-surface hoop stress becomes compressive (−0.628), since the</w:t>
+      </w:r>
+      <w:r>
+        <w:t xml:space="preserve"> </w:t>
+      </w:r>
+      <w:r>
+        <w:t xml:space="preserve">heated inner band pushes against the cold, stiff outer mass. The wall thickness is</w:t>
+      </w:r>
+      <w:r>
+        <w:t xml:space="preserve"> </w:t>
+      </w:r>
+      <w:r>
+        <w:t xml:space="preserve">therefore the geometric lever that trades a small, highly stressed thin wall</w:t>
+      </w:r>
+      <w:r>
+        <w:t xml:space="preserve"> </w:t>
+      </w:r>
+      <w:r>
+        <w:t xml:space="preserve">against a large, mildly stressed but strongly compressive thick wall.</w:t>
+      </w:r>
+    </w:p>
+    <w:bookmarkEnd w:id="94"/>
+    <w:bookmarkStart w:id="98" w:name="response-to-a-gaussian-thermal-shock"/>
+    <w:p>
+      <w:pPr>
+        <w:pStyle w:val="Heading2"/>
+      </w:pPr>
+      <w:r>
+        <w:t xml:space="preserve">4-17. Response to a Gaussian thermal shock</w:t>
+      </w:r>
+    </w:p>
+    <w:p>
+      <w:pPr>
+        <w:pStyle w:val="FirstParagraph"/>
+      </w:pPr>
+      <w:r>
+        <w:rPr>
+          <w:b/>
+          <w:bCs/>
+        </w:rPr>
+        <w:t xml:space="preserve">4-23</w:t>
+      </w:r>
+    </w:p>
+    <w:p>
+      <w:pPr>
+        <w:pStyle w:val="CaptionedFigure"/>
+      </w:pPr>
+      <w:r>
+        <w:drawing>
+          <wp:inline>
+            <wp:extent cx="5334000" cy="3708431"/>
+            <wp:effectExtent b="0" l="0" r="0" t="0"/>
+            <wp:docPr descr="Figure 4-23: Response to a Gaussian thermal shock — Lord–Shulman versus Fourier [R_o/R_i=1.5, L=2.1 m, N_L=7, W_GPL=0.3%, e_m3=0.8604, P_i=50 MPa, simply supported]" title="" id="96" name="Picture"/>
+            <a:graphic>
+              <a:graphicData uri="http://schemas.openxmlformats.org/drawingml/2006/picture">
+                <pic:pic>
+                  <pic:nvPicPr>
+                    <pic:cNvPr descr="figures_ch4_bw/M_gauss_shock.png" id="97" name="Picture"/>
+                    <pic:cNvPicPr>
+                      <a:picLocks noChangeArrowheads="1" noChangeAspect="1"/>
+                    </pic:cNvPicPr>
+                  </pic:nvPicPr>
+                  <pic:blipFill>
+                    <a:blip r:embed="rId95"/>
                     <a:stretch>
                       <a:fillRect/>
                     </a:stretch>
@@ -5788,164 +5945,7 @@
         <w:pStyle w:val="ImageCaption"/>
       </w:pPr>
       <w:r>
-        <w:t xml:space="preserve">Effect of the wall thickness, radius ratio R_o/R_i = 1.25 / 1.5 / 2.0 (inner radius fixed).</w:t>
-      </w:r>
-    </w:p>
-    <w:p>
-      <w:pPr>
-        <w:pStyle w:val="BodyText"/>
-      </w:pPr>
-      <w:r>
-        <w:t xml:space="preserve">Figure 4-22 compares three cylinders with radius ratios R_o/R_i = 1.25, 1.5 and</w:t>
-      </w:r>
-      <w:r>
-        <w:t xml:space="preserve"> </w:t>
-      </w:r>
-      <w:r>
-        <w:t xml:space="preserve">2.0 (inner radius fixed at 1 m; wall thickness 0.25, 0.5 and 1.0 m); the time</w:t>
-      </w:r>
-      <w:r>
-        <w:t xml:space="preserve"> </w:t>
-      </w:r>
-      <w:r>
-        <w:t xml:space="preserve">scale of each is nondimensionalized with its own wall thickness. The thin wall</w:t>
-      </w:r>
-      <w:r>
-        <w:t xml:space="preserve"> </w:t>
-      </w:r>
-      <w:r>
-        <w:t xml:space="preserve">(ratio 1.25) is crossed quickly by the thermal wave, so its outer surface heats</w:t>
-      </w:r>
-      <w:r>
-        <w:t xml:space="preserve"> </w:t>
-      </w:r>
-      <w:r>
-        <w:t xml:space="preserve">fully (outer temperature 0.999), but the small thickness concentrates the thermal</w:t>
-      </w:r>
-      <w:r>
-        <w:t xml:space="preserve"> </w:t>
-      </w:r>
-      <w:r>
-        <w:t xml:space="preserve">strain and produces the largest mechanical response of the study — an</w:t>
-      </w:r>
-      <w:r>
-        <w:t xml:space="preserve"> </w:t>
-      </w:r>
-      <w:r>
-        <w:t xml:space="preserve">inner-surface hoop stress of 4.017 and a peak displacement of 26.6. The thick wall</w:t>
-      </w:r>
-      <w:r>
-        <w:t xml:space="preserve"> </w:t>
-      </w:r>
-      <w:r>
-        <w:t xml:space="preserve">(ratio 2.0) behaves oppositely: within the window the wave does not fully cross,</w:t>
-      </w:r>
-      <w:r>
-        <w:t xml:space="preserve"> </w:t>
-      </w:r>
-      <w:r>
-        <w:t xml:space="preserve">the outer region stays cooler (outer temperature 0.740), the displacement collapses</w:t>
-      </w:r>
-      <w:r>
-        <w:t xml:space="preserve"> </w:t>
-      </w:r>
-      <w:r>
-        <w:t xml:space="preserve">to 2.66, and the inner-surface hoop stress becomes compressive (−0.628), since the</w:t>
-      </w:r>
-      <w:r>
-        <w:t xml:space="preserve"> </w:t>
-      </w:r>
-      <w:r>
-        <w:t xml:space="preserve">heated inner band pushes against the cold, stiff outer mass. The wall thickness is</w:t>
-      </w:r>
-      <w:r>
-        <w:t xml:space="preserve"> </w:t>
-      </w:r>
-      <w:r>
-        <w:t xml:space="preserve">therefore the geometric lever that trades a small, highly stressed thin wall</w:t>
-      </w:r>
-      <w:r>
-        <w:t xml:space="preserve"> </w:t>
-      </w:r>
-      <w:r>
-        <w:t xml:space="preserve">against a large, mildly stressed but strongly compressive thick wall.</w:t>
-      </w:r>
-    </w:p>
-    <w:bookmarkEnd w:id="94"/>
-    <w:bookmarkStart w:id="98" w:name="response-to-a-gaussian-thermal-shock"/>
-    <w:p>
-      <w:pPr>
-        <w:pStyle w:val="Heading2"/>
-      </w:pPr>
-      <w:r>
-        <w:t xml:space="preserve">4-17. Response to a Gaussian thermal shock</w:t>
-      </w:r>
-    </w:p>
-    <w:p>
-      <w:pPr>
-        <w:pStyle w:val="FirstParagraph"/>
-      </w:pPr>
-      <w:r>
-        <w:rPr>
-          <w:b/>
-          <w:bCs/>
-        </w:rPr>
-        <w:t xml:space="preserve">Figure 4-23.</w:t>
-      </w:r>
-    </w:p>
-    <w:p>
-      <w:pPr>
-        <w:pStyle w:val="CaptionedFigure"/>
-      </w:pPr>
-      <w:r>
-        <w:drawing>
-          <wp:inline>
-            <wp:extent cx="5334000" cy="3164350"/>
-            <wp:effectExtent b="0" l="0" r="0" t="0"/>
-            <wp:docPr descr="Response to a Gaussian thermal shock: Lord-Shulman versus Fourier; the LS pulse arrives later, stronger and persists." title="" id="96" name="Picture"/>
-            <a:graphic>
-              <a:graphicData uri="http://schemas.openxmlformats.org/drawingml/2006/picture">
-                <pic:pic>
-                  <pic:nvPicPr>
-                    <pic:cNvPr descr="figures_ch4_bw/M_gauss_shock.png" id="97" name="Picture"/>
-                    <pic:cNvPicPr>
-                      <a:picLocks noChangeArrowheads="1" noChangeAspect="1"/>
-                    </pic:cNvPicPr>
-                  </pic:nvPicPr>
-                  <pic:blipFill>
-                    <a:blip r:embed="rId95"/>
-                    <a:stretch>
-                      <a:fillRect/>
-                    </a:stretch>
-                  </pic:blipFill>
-                  <pic:spPr bwMode="auto">
-                    <a:xfrm>
-                      <a:off x="0" y="0"/>
-                      <a:ext cx="5334000" cy="3164350"/>
-                    </a:xfrm>
-                    <a:prstGeom prst="rect">
-                      <a:avLst/>
-                    </a:prstGeom>
-                    <a:noFill/>
-                    <a:ln w="9525">
-                      <a:noFill/>
-                      <a:headEnd/>
-                      <a:tailEnd/>
-                    </a:ln>
-                  </pic:spPr>
-                </pic:pic>
-              </a:graphicData>
-            </a:graphic>
-          </wp:inline>
-        </w:drawing>
-      </w:r>
-    </w:p>
-    <w:p>
-      <w:pPr>
-        <w:pStyle w:val="ImageCaption"/>
-      </w:pPr>
-      <w:r>
-        <w:t xml:space="preserve">Response to a Gaussian thermal shock: Lord-Shulman versus Fourier; the LS pulse arrives later, stronger and persists.</w:t>
+        <w:t xml:space="preserve">Figure 4-23: Response to a Gaussian thermal shock — Lord–Shulman versus Fourier [R_o/R_i=1.5, L=2.1 m, N_L=7, W_GPL=0.3%, e_m3=0.8604, P_i=50 MPa, simply supported]</w:t>
       </w:r>
     </w:p>
     <w:p>
@@ -6531,7 +6531,7 @@
           <w:b/>
           <w:bCs/>
         </w:rPr>
-        <w:t xml:space="preserve">Figure 4-24.</w:t>
+        <w:t xml:space="preserve">4-24</w:t>
       </w:r>
     </w:p>
     <w:p>
@@ -6543,7 +6543,7 @@
           <wp:inline>
             <wp:extent cx="5334000" cy="3708431"/>
             <wp:effectExtent b="0" l="0" r="0" t="0"/>
-            <wp:docPr descr="Comparison of the generalized thermoelasticity theories: Fourier / Lord-Shulman / dual-phase-lag / Green-Naghdi III." title="" id="102" name="Picture"/>
+            <wp:docPr descr="Figure 4-24: Comparison of the generalized thermoelasticity theories — Fourier, Lord–Shulman, dual-phase-lag and Green–Naghdi III [R_o/R_i=1.5, L=2.1 m, N_L=7, W_GPL=0.3%, e_m3=0.8604, τ*=0.15, P_i=50 MPa, simply supported]" title="" id="102" name="Picture"/>
             <a:graphic>
               <a:graphicData uri="http://schemas.openxmlformats.org/drawingml/2006/picture">
                 <pic:pic>
@@ -6586,7 +6586,7 @@
         <w:pStyle w:val="ImageCaption"/>
       </w:pPr>
       <w:r>
-        <w:t xml:space="preserve">Comparison of the generalized thermoelasticity theories: Fourier / Lord-Shulman / dual-phase-lag / Green-Naghdi III.</w:t>
+        <w:t xml:space="preserve">Figure 4-24: Comparison of the generalized thermoelasticity theories — Fourier, Lord–Shulman, dual-phase-lag and Green–Naghdi III [R_o/R_i=1.5, L=2.1 m, N_L=7, W_GPL=0.3%, e_m3=0.8604, τ*=0.15, P_i=50 MPa, simply supported]</w:t>
       </w:r>
     </w:p>
     <w:p>
@@ -6756,7 +6756,7 @@
         <w:t xml:space="preserve"> </w:t>
       </w:r>
       <w:r>
-        <w:t xml:space="preserve">grows with the relaxation time, up to T* = 1.271 at τ* = 0.87 — impossible under</w:t>
+        <w:t xml:space="preserve">grows with the relaxation time, up to T* = 1.166 at τ* = 0.44 — impossible under</w:t>
       </w:r>
       <w:r>
         <w:t xml:space="preserve"> </w:t>

</xml_diff>

<commit_message>
Ch4 R4: move Fig 4-5 (thermal verification) legend to upper-right
Co-Authored-By: Claude Opus 4.8 (1M context) <noreply@anthropic.com>
</commit_message>
<xml_diff>
--- a/claude/thesis_chapter/RESULTS_CHAPTER_EN_R4_bw.docx
+++ b/claude/thesis_chapter/RESULTS_CHAPTER_EN_R4_bw.docx
@@ -2668,7 +2668,7 @@
       <w:r>
         <w:drawing>
           <wp:inline>
-            <wp:extent cx="5334000" cy="3697845"/>
+            <wp:extent cx="5334000" cy="3700121"/>
             <wp:effectExtent b="0" l="0" r="0" t="0"/>
             <wp:docPr descr="Figure 4-5: Verification (thermal) — transient temperature profiles of the present DQM+Newmark solver against the exact Bessel-series solution at t = 2, 10 and 40 s" title="" id="29" name="Picture"/>
             <a:graphic>
@@ -2689,7 +2689,7 @@
                   <pic:spPr bwMode="auto">
                     <a:xfrm>
                       <a:off x="0" y="0"/>
-                      <a:ext cx="5334000" cy="3697845"/>
+                      <a:ext cx="5334000" cy="3700121"/>
                     </a:xfrm>
                     <a:prstGeom prst="rect">
                       <a:avLst/>

</xml_diff>